<commit_message>
SCF upload and download and new parameter overwriteWithoutAsking, incl. small updates
Just small updates like the hierarchy list have '|' not ',' comma.
</commit_message>
<xml_diff>
--- a/API information/RDBES APIs documentation.docx
+++ b/API information/RDBES APIs documentation.docx
@@ -225,17 +225,12 @@
       </w:r>
       <w:proofErr w:type="spellStart"/>
       <w:r>
-        <w:t>rdbes_upload_</w:t>
-      </w:r>
-      <w:proofErr w:type="gramStart"/>
-      <w:r>
-        <w:t>data</w:t>
+        <w:t>rdbes_upload_data</w:t>
       </w:r>
       <w:proofErr w:type="spellEnd"/>
       <w:r>
         <w:t>(</w:t>
       </w:r>
-      <w:proofErr w:type="gramEnd"/>
     </w:p>
     <w:p>
       <w:r>
@@ -263,19 +258,217 @@
         <w:t xml:space="preserve">      hierarchy = ["</w:t>
       </w:r>
       <w:r>
-        <w:t>HCL"</w:t>
-      </w:r>
-      <w:r>
-        <w:t>,</w:t>
+        <w:t>HCL</w:t>
+      </w:r>
+      <w:r>
+        <w:t xml:space="preserve"> | </w:t>
+      </w:r>
+      <w:r>
+        <w:t>"HCE"</w:t>
+      </w:r>
+      <w:r>
+        <w:t xml:space="preserve"> |</w:t>
       </w:r>
       <w:r>
         <w:t xml:space="preserve"> </w:t>
       </w:r>
       <w:r>
+        <w:t>"H</w:t>
+      </w:r>
+      <w:r>
+        <w:t>1”</w:t>
+      </w:r>
+      <w:r>
+        <w:t xml:space="preserve"> | "H</w:t>
+      </w:r>
+      <w:r>
+        <w:t xml:space="preserve">2” </w:t>
+      </w:r>
+      <w:r>
+        <w:t>| "H</w:t>
+      </w:r>
+      <w:r>
+        <w:t xml:space="preserve">3” </w:t>
+      </w:r>
+      <w:r>
+        <w:t>| "H</w:t>
+      </w:r>
+      <w:r>
+        <w:t xml:space="preserve">4” </w:t>
+      </w:r>
+      <w:r>
+        <w:t>| "H</w:t>
+      </w:r>
+      <w:r>
+        <w:t xml:space="preserve">5” </w:t>
+      </w:r>
+      <w:r>
+        <w:t>| "H</w:t>
+      </w:r>
+      <w:r>
+        <w:t xml:space="preserve">6” </w:t>
+      </w:r>
+      <w:r>
+        <w:t>| "H</w:t>
+      </w:r>
+      <w:r>
+        <w:t xml:space="preserve">7” </w:t>
+      </w:r>
+      <w:r>
+        <w:t>| "H</w:t>
+      </w:r>
+      <w:r>
+        <w:t xml:space="preserve">8” </w:t>
+      </w:r>
+      <w:r>
+        <w:t>| "H</w:t>
+      </w:r>
+      <w:r>
+        <w:t xml:space="preserve">9” </w:t>
+      </w:r>
+      <w:r>
+        <w:t>| "H</w:t>
+      </w:r>
+      <w:r>
+        <w:t xml:space="preserve">10” </w:t>
+      </w:r>
+      <w:r>
+        <w:t>| "H</w:t>
+      </w:r>
+      <w:r>
+        <w:t xml:space="preserve">11” </w:t>
+      </w:r>
+      <w:r>
+        <w:t>| "H</w:t>
+      </w:r>
+      <w:r>
+        <w:t xml:space="preserve">12” </w:t>
+      </w:r>
+      <w:r>
+        <w:t>| "H</w:t>
+      </w:r>
+      <w:r>
+        <w:t>13</w:t>
+      </w:r>
+      <w:r>
+        <w:t>"</w:t>
+      </w:r>
+      <w:r>
+        <w:t xml:space="preserve"> |</w:t>
+      </w:r>
+      <w:r>
+        <w:t xml:space="preserve"> "HSL"</w:t>
+      </w:r>
+      <w:r>
+        <w:t xml:space="preserve"> |</w:t>
+      </w:r>
+      <w:r>
+        <w:t xml:space="preserve"> "HVD</w:t>
+      </w:r>
+      <w:r>
+        <w:t>"</w:t>
+      </w:r>
+      <w:r>
+        <w:t xml:space="preserve"> |</w:t>
+      </w:r>
+      <w:r>
+        <w:t xml:space="preserve"> </w:t>
+      </w:r>
+      <w:r>
+        <w:t>"HNI"</w:t>
+      </w:r>
+      <w:r>
+        <w:t xml:space="preserve"> |</w:t>
+      </w:r>
+      <w:r>
+        <w:t xml:space="preserve"> </w:t>
+      </w:r>
+      <w:r>
+        <w:t>"HEN"</w:t>
+      </w:r>
+      <w:r>
+        <w:t xml:space="preserve"> |</w:t>
+      </w:r>
+      <w:r>
+        <w:t xml:space="preserve"> </w:t>
+      </w:r>
+      <w:r>
+        <w:t>"HSN"</w:t>
+      </w:r>
+      <w:r>
+        <w:t xml:space="preserve"> |</w:t>
+      </w:r>
+      <w:r>
+        <w:t xml:space="preserve"> </w:t>
+      </w:r>
+      <w:r>
+        <w:rPr>
+          <w:highlight w:val="yellow"/>
+        </w:rPr>
+        <w:t>"HCI"</w:t>
+      </w:r>
+      <w:r>
+        <w:t>]</w:t>
+      </w:r>
+    </w:p>
+    <w:p>
+      <w:proofErr w:type="spellStart"/>
+      <w:r>
+        <w:rPr>
+          <w:highlight w:val="yellow"/>
+        </w:rPr>
+        <w:t>overwriteWithoutAsking</w:t>
+      </w:r>
+      <w:proofErr w:type="spellEnd"/>
+      <w:r>
+        <w:rPr>
+          <w:highlight w:val="yellow"/>
+        </w:rPr>
+        <w:t xml:space="preserve"> = TRUE</w:t>
+      </w:r>
+    </w:p>
+    <w:p>
+      <w:r>
+        <w:t>RDBES hierarch</w:t>
+      </w:r>
+      <w:r>
+        <w:t>ies</w:t>
+      </w:r>
+      <w:r>
+        <w:t xml:space="preserve"> </w:t>
+      </w:r>
+      <w:r>
+        <w:t>are</w:t>
+      </w:r>
+      <w:r>
+        <w:t xml:space="preserve">: </w:t>
+      </w:r>
+      <w:r>
+        <w:t xml:space="preserve"> ["HCL"</w:t>
+      </w:r>
+      <w:r>
+        <w:t xml:space="preserve"> |</w:t>
+      </w:r>
+      <w:r>
+        <w:t xml:space="preserve"> </w:t>
+      </w:r>
+      <w:r>
         <w:t>"HCE"</w:t>
       </w:r>
       <w:r>
-        <w:t>,</w:t>
+        <w:t xml:space="preserve"> |</w:t>
+      </w:r>
+      <w:r>
+        <w:t xml:space="preserve"> "HSL"</w:t>
+      </w:r>
+      <w:r>
+        <w:t xml:space="preserve"> |</w:t>
+      </w:r>
+      <w:r>
+        <w:t xml:space="preserve"> "HVD"</w:t>
+      </w:r>
+      <w:r>
+        <w:t xml:space="preserve"> |</w:t>
       </w:r>
       <w:r>
         <w:t xml:space="preserve"> </w:t>
@@ -284,7 +477,10 @@
         <w:t>"H</w:t>
       </w:r>
       <w:r>
-        <w:t>1”,</w:t>
+        <w:t>1”</w:t>
+      </w:r>
+      <w:r>
+        <w:t xml:space="preserve"> |</w:t>
       </w:r>
       <w:r>
         <w:t xml:space="preserve"> </w:t>
@@ -293,7 +489,10 @@
         <w:t>"H</w:t>
       </w:r>
       <w:r>
-        <w:t>2”,</w:t>
+        <w:t>2”</w:t>
+      </w:r>
+      <w:r>
+        <w:t xml:space="preserve"> |</w:t>
       </w:r>
       <w:r>
         <w:t xml:space="preserve"> </w:t>
@@ -302,7 +501,10 @@
         <w:t>"H</w:t>
       </w:r>
       <w:r>
-        <w:t>3”,</w:t>
+        <w:t>3”</w:t>
+      </w:r>
+      <w:r>
+        <w:t xml:space="preserve"> |</w:t>
       </w:r>
       <w:r>
         <w:t xml:space="preserve"> </w:t>
@@ -311,7 +513,10 @@
         <w:t>"H</w:t>
       </w:r>
       <w:r>
-        <w:t>4”,</w:t>
+        <w:t>4”</w:t>
+      </w:r>
+      <w:r>
+        <w:t xml:space="preserve"> |</w:t>
       </w:r>
       <w:r>
         <w:t xml:space="preserve"> </w:t>
@@ -320,7 +525,10 @@
         <w:t>"H</w:t>
       </w:r>
       <w:r>
-        <w:t>5”,</w:t>
+        <w:t>5”</w:t>
+      </w:r>
+      <w:r>
+        <w:t xml:space="preserve"> |</w:t>
       </w:r>
       <w:r>
         <w:t xml:space="preserve"> </w:t>
@@ -329,7 +537,10 @@
         <w:t>"H</w:t>
       </w:r>
       <w:r>
-        <w:t>6”,</w:t>
+        <w:t>6”</w:t>
+      </w:r>
+      <w:r>
+        <w:t xml:space="preserve"> |</w:t>
       </w:r>
       <w:r>
         <w:t xml:space="preserve"> </w:t>
@@ -338,37 +549,67 @@
         <w:t>"H</w:t>
       </w:r>
       <w:r>
-        <w:t xml:space="preserve">7”, </w:t>
+        <w:t>7”</w:t>
+      </w:r>
+      <w:r>
+        <w:t xml:space="preserve"> |</w:t>
+      </w:r>
+      <w:r>
+        <w:t xml:space="preserve"> </w:t>
       </w:r>
       <w:r>
         <w:t>"H</w:t>
       </w:r>
       <w:r>
-        <w:t xml:space="preserve">8”, </w:t>
+        <w:t>8”</w:t>
+      </w:r>
+      <w:r>
+        <w:t xml:space="preserve"> |</w:t>
+      </w:r>
+      <w:r>
+        <w:t xml:space="preserve"> </w:t>
       </w:r>
       <w:r>
         <w:t>"H</w:t>
       </w:r>
       <w:r>
-        <w:t xml:space="preserve">9”, </w:t>
+        <w:t>9”</w:t>
+      </w:r>
+      <w:r>
+        <w:t xml:space="preserve"> |</w:t>
+      </w:r>
+      <w:r>
+        <w:t xml:space="preserve"> </w:t>
       </w:r>
       <w:r>
         <w:t>"H</w:t>
       </w:r>
       <w:r>
-        <w:t>10”,</w:t>
+        <w:t>10”</w:t>
+      </w:r>
+      <w:r>
+        <w:t xml:space="preserve"> |</w:t>
       </w:r>
       <w:r>
         <w:t xml:space="preserve"> "H</w:t>
       </w:r>
       <w:r>
-        <w:t xml:space="preserve">11”, </w:t>
+        <w:t>11”</w:t>
+      </w:r>
+      <w:r>
+        <w:t xml:space="preserve"> |</w:t>
+      </w:r>
+      <w:r>
+        <w:t xml:space="preserve"> </w:t>
       </w:r>
       <w:r>
         <w:t>"H</w:t>
       </w:r>
       <w:r>
-        <w:t>12”,</w:t>
+        <w:t>12”</w:t>
+      </w:r>
+      <w:r>
+        <w:t xml:space="preserve"> |</w:t>
       </w:r>
       <w:r>
         <w:t xml:space="preserve"> "H</w:t>
@@ -380,335 +621,92 @@
         <w:t>"</w:t>
       </w:r>
       <w:r>
-        <w:t>,</w:t>
-      </w:r>
-      <w:r>
-        <w:t xml:space="preserve"> "HSL"</w:t>
-      </w:r>
-      <w:r>
-        <w:t>,</w:t>
-      </w:r>
-      <w:r>
-        <w:t xml:space="preserve"> "HVD</w:t>
+        <w:t>]</w:t>
+      </w:r>
+    </w:p>
+    <w:p>
+      <w:r>
+        <w:t xml:space="preserve">CEF </w:t>
+      </w:r>
+      <w:r>
+        <w:t>hierarch</w:t>
+      </w:r>
+      <w:r>
+        <w:t>ies</w:t>
+      </w:r>
+      <w:r>
+        <w:t xml:space="preserve"> </w:t>
+      </w:r>
+      <w:r>
+        <w:t>are</w:t>
+      </w:r>
+      <w:r>
+        <w:t xml:space="preserve"> </w:t>
+      </w:r>
+      <w:r>
+        <w:t>[</w:t>
       </w:r>
       <w:r>
         <w:t>"</w:t>
       </w:r>
       <w:r>
-        <w:t>,</w:t>
+        <w:t>HNI"</w:t>
+      </w:r>
+      <w:r>
+        <w:t xml:space="preserve"> |</w:t>
+      </w:r>
+      <w:r>
+        <w:t xml:space="preserve"> "HEN"</w:t>
+      </w:r>
+      <w:r>
+        <w:t xml:space="preserve"> |</w:t>
+      </w:r>
+      <w:r>
+        <w:t xml:space="preserve"> "HSN</w:t>
       </w:r>
       <w:r>
         <w:t xml:space="preserve"> </w:t>
       </w:r>
       <w:r>
-        <w:t>"HNI"</w:t>
-      </w:r>
-      <w:r>
-        <w:t>,</w:t>
-      </w:r>
-      <w:r>
+        <w:t>"]</w:t>
+      </w:r>
+    </w:p>
+    <w:p>
+      <w:r>
+        <w:rPr>
+          <w:highlight w:val="yellow"/>
+        </w:rPr>
+        <w:t>S</w:t>
+      </w:r>
+      <w:r>
+        <w:rPr>
+          <w:highlight w:val="yellow"/>
+        </w:rPr>
+        <w:t>CF hierarch</w:t>
+      </w:r>
+      <w:r>
+        <w:rPr>
+          <w:highlight w:val="yellow"/>
+        </w:rPr>
+        <w:t>ies</w:t>
+      </w:r>
+      <w:r>
+        <w:rPr>
+          <w:highlight w:val="yellow"/>
+        </w:rPr>
         <w:t xml:space="preserve"> </w:t>
       </w:r>
       <w:r>
-        <w:t>"HEN"</w:t>
-      </w:r>
-      <w:r>
-        <w:t>,</w:t>
-      </w:r>
-      <w:r>
-        <w:t xml:space="preserve"> </w:t>
-      </w:r>
-      <w:r>
-        <w:t>"HSN"</w:t>
-      </w:r>
-      <w:r>
-        <w:t>,</w:t>
-      </w:r>
-      <w:r>
-        <w:t xml:space="preserve"> </w:t>
-      </w:r>
-      <w:r>
-        <w:rPr>
-          <w:highlight w:val="yellow"/>
-        </w:rPr>
-        <w:t>"HCI"</w:t>
-      </w:r>
-      <w:r>
-        <w:t>]</w:t>
-      </w:r>
-      <w:r>
-        <w:t>,</w:t>
-      </w:r>
-    </w:p>
-    <w:p>
-      <w:proofErr w:type="spellStart"/>
-      <w:r>
-        <w:rPr>
-          <w:highlight w:val="yellow"/>
-        </w:rPr>
-        <w:t>overwriteWithoutAsking</w:t>
-      </w:r>
-      <w:proofErr w:type="spellEnd"/>
-      <w:r>
-        <w:rPr>
-          <w:highlight w:val="yellow"/>
-        </w:rPr>
-        <w:t xml:space="preserve"> = TRUE</w:t>
-      </w:r>
-    </w:p>
-    <w:p>
-      <w:r>
-        <w:t>RDBES data</w:t>
-      </w:r>
-      <w:r>
-        <w:t xml:space="preserve"> file types</w:t>
-      </w:r>
-      <w:r>
-        <w:t>: hierarchy = ["HCL"</w:t>
-      </w:r>
-      <w:r>
-        <w:t>,</w:t>
-      </w:r>
-      <w:r>
-        <w:t xml:space="preserve"> </w:t>
-      </w:r>
-      <w:r>
-        <w:t>"HCE"</w:t>
-      </w:r>
-      <w:r>
-        <w:t>,</w:t>
-      </w:r>
-      <w:r>
-        <w:t xml:space="preserve"> </w:t>
-      </w:r>
-      <w:r>
-        <w:t>"H</w:t>
-      </w:r>
-      <w:r>
-        <w:t>1”</w:t>
-      </w:r>
-      <w:r>
-        <w:t>,</w:t>
-      </w:r>
-      <w:r>
-        <w:t xml:space="preserve"> </w:t>
-      </w:r>
-      <w:r>
-        <w:t>"H</w:t>
-      </w:r>
-      <w:r>
-        <w:t>2”</w:t>
-      </w:r>
-      <w:r>
-        <w:t>,</w:t>
-      </w:r>
-      <w:r>
-        <w:t xml:space="preserve"> </w:t>
-      </w:r>
-      <w:r>
-        <w:t>"H</w:t>
-      </w:r>
-      <w:r>
-        <w:t>3”</w:t>
-      </w:r>
-      <w:r>
-        <w:t>,</w:t>
-      </w:r>
-      <w:r>
-        <w:t xml:space="preserve"> </w:t>
-      </w:r>
-      <w:r>
-        <w:t>"H</w:t>
-      </w:r>
-      <w:r>
-        <w:t>4”</w:t>
-      </w:r>
-      <w:r>
-        <w:t>,</w:t>
-      </w:r>
-      <w:r>
-        <w:t xml:space="preserve"> </w:t>
-      </w:r>
-      <w:r>
-        <w:t>"H</w:t>
-      </w:r>
-      <w:r>
-        <w:t>5”</w:t>
-      </w:r>
-      <w:r>
-        <w:t>,</w:t>
-      </w:r>
-      <w:r>
-        <w:t xml:space="preserve"> </w:t>
-      </w:r>
-      <w:r>
-        <w:t>"H</w:t>
-      </w:r>
-      <w:r>
-        <w:t>6”</w:t>
-      </w:r>
-      <w:r>
-        <w:t>,</w:t>
-      </w:r>
-      <w:r>
-        <w:t xml:space="preserve"> </w:t>
-      </w:r>
-      <w:r>
-        <w:t>"H</w:t>
-      </w:r>
-      <w:r>
-        <w:t>7”</w:t>
-      </w:r>
-      <w:r>
-        <w:t>,</w:t>
-      </w:r>
-      <w:r>
-        <w:t xml:space="preserve"> </w:t>
-      </w:r>
-      <w:r>
-        <w:t>"H</w:t>
-      </w:r>
-      <w:r>
-        <w:t>8”</w:t>
-      </w:r>
-      <w:r>
-        <w:t>,</w:t>
-      </w:r>
-      <w:r>
-        <w:t xml:space="preserve"> </w:t>
-      </w:r>
-      <w:r>
-        <w:t>"H</w:t>
-      </w:r>
-      <w:r>
-        <w:t>9”</w:t>
-      </w:r>
-      <w:r>
-        <w:t>,</w:t>
-      </w:r>
-      <w:r>
-        <w:t xml:space="preserve"> </w:t>
-      </w:r>
-      <w:r>
-        <w:t>"H</w:t>
-      </w:r>
-      <w:r>
-        <w:t>10”</w:t>
-      </w:r>
-      <w:r>
-        <w:t>,</w:t>
-      </w:r>
-      <w:r>
-        <w:t xml:space="preserve"> "H</w:t>
-      </w:r>
-      <w:r>
-        <w:t>11”</w:t>
-      </w:r>
-      <w:r>
-        <w:t>,</w:t>
-      </w:r>
-      <w:r>
-        <w:t xml:space="preserve"> </w:t>
-      </w:r>
-      <w:r>
-        <w:t>"H</w:t>
-      </w:r>
-      <w:r>
-        <w:t>12”</w:t>
-      </w:r>
-      <w:r>
-        <w:t>,</w:t>
-      </w:r>
-      <w:r>
-        <w:t xml:space="preserve"> "H</w:t>
-      </w:r>
-      <w:r>
-        <w:t>13</w:t>
-      </w:r>
-      <w:r>
-        <w:t>"</w:t>
-      </w:r>
-      <w:r>
-        <w:t>,</w:t>
-      </w:r>
-      <w:r>
-        <w:t xml:space="preserve"> "HSL"</w:t>
-      </w:r>
-      <w:r>
-        <w:t>,</w:t>
-      </w:r>
-      <w:r>
-        <w:t xml:space="preserve"> "HVD"</w:t>
-      </w:r>
-      <w:r>
-        <w:t>]</w:t>
-      </w:r>
-    </w:p>
-    <w:p>
-      <w:r>
-        <w:t>CEF data</w:t>
-      </w:r>
-      <w:r>
-        <w:t xml:space="preserve"> file types</w:t>
-      </w:r>
-      <w:r>
-        <w:t xml:space="preserve">: </w:t>
-      </w:r>
-      <w:r>
-        <w:t xml:space="preserve">hierarchy = </w:t>
-      </w:r>
-      <w:r>
-        <w:t>[</w:t>
-      </w:r>
-      <w:r>
-        <w:t>"</w:t>
-      </w:r>
-      <w:r>
-        <w:t>HNI"</w:t>
-      </w:r>
-      <w:r>
-        <w:t>,</w:t>
-      </w:r>
-      <w:r>
-        <w:t xml:space="preserve"> "HEN"</w:t>
-      </w:r>
-      <w:r>
-        <w:t>,</w:t>
-      </w:r>
-      <w:r>
-        <w:t xml:space="preserve"> "HSN</w:t>
-      </w:r>
-      <w:r>
-        <w:t xml:space="preserve"> </w:t>
-      </w:r>
-      <w:r>
-        <w:t>"]</w:t>
-      </w:r>
-    </w:p>
-    <w:p>
-      <w:r>
-        <w:rPr>
-          <w:highlight w:val="yellow"/>
-        </w:rPr>
-        <w:t>S</w:t>
-      </w:r>
-      <w:r>
-        <w:rPr>
-          <w:highlight w:val="yellow"/>
-        </w:rPr>
-        <w:t>CF data</w:t>
-      </w:r>
-      <w:r>
-        <w:rPr>
-          <w:highlight w:val="yellow"/>
-        </w:rPr>
-        <w:t xml:space="preserve"> file types</w:t>
-      </w:r>
-      <w:r>
-        <w:rPr>
-          <w:highlight w:val="yellow"/>
-        </w:rPr>
-        <w:t>: hierarchy = ["H</w:t>
+        <w:rPr>
+          <w:highlight w:val="yellow"/>
+        </w:rPr>
+        <w:t>are</w:t>
+      </w:r>
+      <w:r>
+        <w:rPr>
+          <w:highlight w:val="yellow"/>
+        </w:rPr>
+        <w:t xml:space="preserve"> ["H</w:t>
       </w:r>
       <w:r>
         <w:rPr>
@@ -877,33 +875,7 @@
                 <w:szCs w:val="22"/>
                 <w:highlight w:val="yellow"/>
               </w:rPr>
-              <w:t>National Information (</w:t>
-            </w:r>
-            <w:proofErr w:type="gramStart"/>
-            <w:r>
-              <w:rPr>
-                <w:rFonts w:ascii="Aptos Narrow" w:hAnsi="Aptos Narrow"/>
-                <w:b/>
-                <w:bCs/>
-                <w:color w:val="000000"/>
-                <w:sz w:val="22"/>
-                <w:szCs w:val="22"/>
-                <w:highlight w:val="yellow"/>
-              </w:rPr>
-              <w:t>NI)  for</w:t>
-            </w:r>
-            <w:proofErr w:type="gramEnd"/>
-            <w:r>
-              <w:rPr>
-                <w:rFonts w:ascii="Aptos Narrow" w:hAnsi="Aptos Narrow"/>
-                <w:b/>
-                <w:bCs/>
-                <w:color w:val="000000"/>
-                <w:sz w:val="22"/>
-                <w:szCs w:val="22"/>
-                <w:highlight w:val="yellow"/>
-              </w:rPr>
-              <w:t xml:space="preserve"> CN and DN</w:t>
+              <w:t>National Information (NI)  for CN and DN</w:t>
             </w:r>
           </w:p>
         </w:tc>
@@ -2004,15 +1976,7 @@
     </w:p>
     <w:p>
       <w:r>
-        <w:t xml:space="preserve">--- Step 2: </w:t>
-      </w:r>
-      <w:proofErr w:type="gramStart"/>
-      <w:r>
-        <w:t>Starting Screening</w:t>
-      </w:r>
-      <w:proofErr w:type="gramEnd"/>
-      <w:r>
-        <w:t xml:space="preserve"> ---</w:t>
+        <w:t>--- Step 2: Starting Screening ---</w:t>
       </w:r>
     </w:p>
     <w:p>
@@ -2068,23 +2032,7 @@
     </w:p>
     <w:p>
       <w:r>
-        <w:t xml:space="preserve">&gt;&gt; SUCCESS: You have successfully screened your </w:t>
-      </w:r>
-      <w:proofErr w:type="gramStart"/>
-      <w:r>
-        <w:t>file:Importtest_HNI.csv.Your</w:t>
-      </w:r>
-      <w:proofErr w:type="gramEnd"/>
-      <w:r>
-        <w:t xml:space="preserve"> file will now be </w:t>
-      </w:r>
-      <w:proofErr w:type="gramStart"/>
-      <w:r>
-        <w:t>imported</w:t>
-      </w:r>
-      <w:proofErr w:type="gramEnd"/>
-      <w:r>
-        <w:t xml:space="preserve"> and you will receive an email notification upon completion of the import process.</w:t>
+        <w:t>&gt;&gt; SUCCESS: You have successfully screened your file:Importtest_HNI.csv.Your file will now be imported and you will receive an email notification upon completion of the import process.</w:t>
       </w:r>
     </w:p>
     <w:p>
@@ -2130,15 +2078,7 @@
     </w:p>
     <w:p>
       <w:r>
-        <w:t xml:space="preserve">--- Step 2: </w:t>
-      </w:r>
-      <w:proofErr w:type="gramStart"/>
-      <w:r>
-        <w:t>Starting Screening</w:t>
-      </w:r>
-      <w:proofErr w:type="gramEnd"/>
-      <w:r>
-        <w:t xml:space="preserve"> ---</w:t>
+        <w:t>--- Step 2: Starting Screening ---</w:t>
       </w:r>
     </w:p>
     <w:p>
@@ -2220,15 +2160,7 @@
     </w:p>
     <w:p>
       <w:r>
-        <w:t xml:space="preserve">  "Message": " At least 1 set-based errors found. Note that a maximum of 100 errors </w:t>
-      </w:r>
-      <w:proofErr w:type="gramStart"/>
-      <w:r>
-        <w:t>are</w:t>
-      </w:r>
-      <w:proofErr w:type="gramEnd"/>
-      <w:r>
-        <w:t xml:space="preserve"> being reported at once.",</w:t>
+        <w:t xml:space="preserve">  "Message": " At least 1 set-based errors found. Note that a maximum of 100 errors are being reported at once.",</w:t>
       </w:r>
     </w:p>
     <w:p>
@@ -2385,15 +2317,7 @@
         <w:t>s</w:t>
       </w:r>
       <w:r>
-        <w:t xml:space="preserve"> of </w:t>
-      </w:r>
-      <w:proofErr w:type="gramStart"/>
-      <w:r>
-        <w:t>a</w:t>
-      </w:r>
-      <w:proofErr w:type="gramEnd"/>
-      <w:r>
-        <w:t xml:space="preserve"> </w:t>
+        <w:t xml:space="preserve"> of a </w:t>
       </w:r>
       <w:r>
         <w:t xml:space="preserve">uploading data by </w:t>
@@ -2598,17 +2522,12 @@
       </w:r>
       <w:proofErr w:type="spellStart"/>
       <w:r>
-        <w:t>rdbes_upload_</w:t>
-      </w:r>
-      <w:proofErr w:type="gramStart"/>
-      <w:r>
-        <w:t>data</w:t>
+        <w:t>rdbes_upload_data</w:t>
       </w:r>
       <w:proofErr w:type="spellEnd"/>
       <w:r>
         <w:t>(</w:t>
       </w:r>
-      <w:proofErr w:type="gramEnd"/>
     </w:p>
     <w:p>
       <w:proofErr w:type="spellStart"/>
@@ -2703,17 +2622,12 @@
       </w:r>
       <w:proofErr w:type="spellStart"/>
       <w:r>
-        <w:t>rdbes_upload_</w:t>
-      </w:r>
-      <w:proofErr w:type="gramStart"/>
-      <w:r>
-        <w:t>data</w:t>
+        <w:t>rdbes_upload_data</w:t>
       </w:r>
       <w:proofErr w:type="spellEnd"/>
       <w:r>
         <w:t>(</w:t>
       </w:r>
-      <w:proofErr w:type="gramEnd"/>
     </w:p>
     <w:p>
       <w:proofErr w:type="spellStart"/>
@@ -2799,17 +2713,12 @@
       </w:r>
       <w:proofErr w:type="spellStart"/>
       <w:r>
-        <w:t>rdbes_upload_</w:t>
-      </w:r>
-      <w:proofErr w:type="gramStart"/>
-      <w:r>
-        <w:t>data</w:t>
+        <w:t>rdbes_upload_data</w:t>
       </w:r>
       <w:proofErr w:type="spellEnd"/>
       <w:r>
         <w:t>(</w:t>
       </w:r>
-      <w:proofErr w:type="gramEnd"/>
     </w:p>
     <w:p>
       <w:proofErr w:type="spellStart"/>
@@ -2866,17 +2775,12 @@
       </w:r>
       <w:proofErr w:type="spellStart"/>
       <w:r>
-        <w:t>rdbes_upload_</w:t>
-      </w:r>
-      <w:proofErr w:type="gramStart"/>
-      <w:r>
-        <w:t>data</w:t>
+        <w:t>rdbes_upload_data</w:t>
       </w:r>
       <w:proofErr w:type="spellEnd"/>
       <w:r>
         <w:t>(</w:t>
       </w:r>
-      <w:proofErr w:type="gramEnd"/>
     </w:p>
     <w:p>
       <w:proofErr w:type="spellStart"/>
@@ -3016,14 +2920,7 @@
         <w:rPr>
           <w:highlight w:val="yellow"/>
         </w:rPr>
-        <w:t>rdbes_upload_</w:t>
-      </w:r>
-      <w:proofErr w:type="gramStart"/>
-      <w:r>
-        <w:rPr>
-          <w:highlight w:val="yellow"/>
-        </w:rPr>
-        <w:t>data</w:t>
+        <w:t>rdbes_upload_data</w:t>
       </w:r>
       <w:proofErr w:type="spellEnd"/>
       <w:r>
@@ -3032,7 +2929,6 @@
         </w:rPr>
         <w:t>(</w:t>
       </w:r>
-      <w:proofErr w:type="gramEnd"/>
     </w:p>
     <w:p>
       <w:pPr>
@@ -3591,13 +3487,8 @@
       </w:r>
       <w:proofErr w:type="spellEnd"/>
       <w:r>
-        <w:t xml:space="preserve"> &lt;- </w:t>
-      </w:r>
-      <w:proofErr w:type="gramStart"/>
-      <w:r>
-        <w:t>list(</w:t>
-      </w:r>
-      <w:proofErr w:type="gramEnd"/>
+        <w:t xml:space="preserve"> &lt;- list(</w:t>
+      </w:r>
     </w:p>
     <w:p>
       <w:r>
@@ -3688,15 +3579,7 @@
       </w:r>
       <w:proofErr w:type="spellEnd"/>
       <w:r>
-        <w:t>"</w:t>
-      </w:r>
-      <w:proofErr w:type="gramStart"/>
-      <w:r>
-        <w:t>:  [</w:t>
-      </w:r>
-      <w:proofErr w:type="gramEnd"/>
-      <w:r>
-        <w:t>"2020","2021","2022","2023"],</w:t>
+        <w:t>":  ["2020","2021","2022","2023"],</w:t>
       </w:r>
     </w:p>
     <w:p>
@@ -3731,15 +3614,7 @@
       </w:r>
       <w:proofErr w:type="spellEnd"/>
       <w:r>
-        <w:t>"</w:t>
-      </w:r>
-      <w:proofErr w:type="gramStart"/>
-      <w:r>
-        <w:t>:  [</w:t>
-      </w:r>
-      <w:proofErr w:type="gramEnd"/>
-      <w:r>
-        <w:t>"2020","2021","2022","2023"],</w:t>
+        <w:t>":  ["2020","2021","2022","2023"],</w:t>
       </w:r>
     </w:p>
     <w:p>
@@ -3752,15 +3627,7 @@
       </w:r>
       <w:proofErr w:type="spellEnd"/>
       <w:r>
-        <w:t>"</w:t>
-      </w:r>
-      <w:proofErr w:type="gramStart"/>
-      <w:r>
-        <w:t>:  [</w:t>
-      </w:r>
-      <w:proofErr w:type="gramEnd"/>
-      <w:r>
-        <w:t>"2020","2021","2022","2023"]</w:t>
+        <w:t>":  ["2020","2021","2022","2023"]</w:t>
       </w:r>
     </w:p>
     <w:p>
@@ -3808,23 +3675,7 @@
           <w:b/>
           <w:bCs/>
         </w:rPr>
-        <w:t xml:space="preserve">the list of </w:t>
-      </w:r>
-      <w:proofErr w:type="gramStart"/>
-      <w:r>
-        <w:rPr>
-          <w:b/>
-          <w:bCs/>
-        </w:rPr>
-        <w:t>parameter</w:t>
-      </w:r>
-      <w:proofErr w:type="gramEnd"/>
-      <w:r>
-        <w:rPr>
-          <w:b/>
-          <w:bCs/>
-        </w:rPr>
-        <w:t xml:space="preserve"> see the following</w:t>
+        <w:t>the list of parameter see the following</w:t>
       </w:r>
       <w:r>
         <w:rPr>
@@ -3951,30 +3802,17 @@
       <w:r>
         <w:t xml:space="preserve">It is also possible to download one </w:t>
       </w:r>
-      <w:proofErr w:type="gramStart"/>
       <w:r>
         <w:t xml:space="preserve">hierarchy </w:t>
       </w:r>
       <w:r>
-        <w:t>)</w:t>
-      </w:r>
-      <w:proofErr w:type="gramEnd"/>
-      <w:r>
-        <w:t xml:space="preserve"> "HNI", "HEN", "HSN" </w:t>
+        <w:t xml:space="preserve">) "HNI", "HEN", "HSN" </w:t>
       </w:r>
       <w:r>
         <w:t>at the time</w:t>
       </w:r>
       <w:r>
-        <w:t xml:space="preserve">, two </w:t>
-      </w:r>
-      <w:proofErr w:type="gramStart"/>
-      <w:r>
-        <w:t>tables</w:t>
-      </w:r>
-      <w:proofErr w:type="gramEnd"/>
-      <w:r>
-        <w:t xml:space="preserve">/record types for "HNI", and one </w:t>
+        <w:t xml:space="preserve">, two tables/record types for "HNI", and one </w:t>
       </w:r>
       <w:r>
         <w:t>tables/record types for "HEN", "HSN", see the example below</w:t>
@@ -3987,13 +3825,8 @@
       </w:r>
       <w:proofErr w:type="spellEnd"/>
       <w:r>
-        <w:t xml:space="preserve"> &lt;- </w:t>
-      </w:r>
-      <w:proofErr w:type="gramStart"/>
-      <w:r>
-        <w:t>list(</w:t>
-      </w:r>
-      <w:proofErr w:type="gramEnd"/>
+        <w:t xml:space="preserve"> &lt;- list(</w:t>
+      </w:r>
     </w:p>
     <w:p>
       <w:r>
@@ -4090,15 +3923,7 @@
       </w:r>
       <w:proofErr w:type="spellEnd"/>
       <w:r>
-        <w:t>"</w:t>
-      </w:r>
-      <w:proofErr w:type="gramStart"/>
-      <w:r>
-        <w:t>:  [</w:t>
-      </w:r>
-      <w:proofErr w:type="gramEnd"/>
-      <w:r>
-        <w:t>"2020","2021","2022","2023"],</w:t>
+        <w:t>":  ["2020","2021","2022","2023"],</w:t>
       </w:r>
     </w:p>
     <w:p>
@@ -4340,16 +4165,8 @@
         <w:rPr>
           <w:highlight w:val="yellow"/>
         </w:rPr>
-        <w:t xml:space="preserve"> &lt;- </w:t>
-      </w:r>
-      <w:proofErr w:type="gramStart"/>
-      <w:r>
-        <w:rPr>
-          <w:highlight w:val="yellow"/>
-        </w:rPr>
-        <w:t>list(</w:t>
-      </w:r>
-      <w:proofErr w:type="gramEnd"/>
+        <w:t xml:space="preserve"> &lt;- list(</w:t>
+      </w:r>
       <w:r>
         <w:rPr>
           <w:highlight w:val="yellow"/>
@@ -4472,16 +4289,8 @@
         <w:rPr>
           <w:highlight w:val="yellow"/>
         </w:rPr>
-        <w:t xml:space="preserve">         = </w:t>
-      </w:r>
-      <w:proofErr w:type="gramStart"/>
-      <w:r>
-        <w:rPr>
-          <w:highlight w:val="yellow"/>
-        </w:rPr>
-        <w:t>list(</w:t>
-      </w:r>
-      <w:proofErr w:type="gramEnd"/>
+        <w:t>         = list(</w:t>
+      </w:r>
       <w:r>
         <w:rPr>
           <w:highlight w:val="yellow"/>
@@ -4536,21 +4345,7 @@
         <w:rPr>
           <w:highlight w:val="yellow"/>
         </w:rPr>
-        <w:t xml:space="preserve">            = </w:t>
-      </w:r>
-      <w:proofErr w:type="gramStart"/>
-      <w:r>
-        <w:rPr>
-          <w:highlight w:val="yellow"/>
-        </w:rPr>
-        <w:t>list(</w:t>
-      </w:r>
-      <w:proofErr w:type="gramEnd"/>
-      <w:r>
-        <w:rPr>
-          <w:highlight w:val="yellow"/>
-        </w:rPr>
-        <w:t>"2024"</w:t>
+        <w:t>            = list("2024"</w:t>
       </w:r>
       <w:r>
         <w:rPr>
@@ -4618,25 +4413,7 @@
           <w:bCs/>
           <w:highlight w:val="yellow"/>
         </w:rPr>
-        <w:t xml:space="preserve">Files are download by calling the API with the list of </w:t>
-      </w:r>
-      <w:proofErr w:type="gramStart"/>
-      <w:r>
-        <w:rPr>
-          <w:b/>
-          <w:bCs/>
-          <w:highlight w:val="yellow"/>
-        </w:rPr>
-        <w:t>parameter</w:t>
-      </w:r>
-      <w:proofErr w:type="gramEnd"/>
-      <w:r>
-        <w:rPr>
-          <w:b/>
-          <w:bCs/>
-          <w:highlight w:val="yellow"/>
-        </w:rPr>
-        <w:t xml:space="preserve"> see the following:</w:t>
+        <w:t>Files are download by calling the API with the list of parameter see the following:</w:t>
       </w:r>
     </w:p>
     <w:p>
@@ -4871,13 +4648,8 @@
       </w:r>
       <w:proofErr w:type="spellEnd"/>
       <w:r>
-        <w:t xml:space="preserve"> &lt;- </w:t>
-      </w:r>
-      <w:proofErr w:type="gramStart"/>
-      <w:r>
-        <w:t>list(</w:t>
-      </w:r>
-      <w:proofErr w:type="gramEnd"/>
+        <w:t xml:space="preserve"> &lt;- list(</w:t>
+      </w:r>
     </w:p>
     <w:p>
       <w:r>
@@ -4921,13 +4693,8 @@
       </w:r>
       <w:proofErr w:type="spellEnd"/>
       <w:r>
-        <w:t xml:space="preserve"> = </w:t>
-      </w:r>
-      <w:proofErr w:type="gramStart"/>
-      <w:r>
-        <w:t>list(</w:t>
-      </w:r>
-      <w:proofErr w:type="gramEnd"/>
+        <w:t xml:space="preserve"> = list(</w:t>
+      </w:r>
     </w:p>
     <w:p>
       <w:r>
@@ -4952,15 +4719,7 @@
       </w:r>
       <w:proofErr w:type="spellEnd"/>
       <w:r>
-        <w:t xml:space="preserve"> = </w:t>
-      </w:r>
-      <w:proofErr w:type="gramStart"/>
-      <w:r>
-        <w:t>list(</w:t>
-      </w:r>
-      <w:proofErr w:type="gramEnd"/>
-      <w:r>
-        <w:t>"2024")</w:t>
+        <w:t xml:space="preserve"> = list("2024")</w:t>
       </w:r>
     </w:p>
     <w:p>
@@ -5098,13 +4857,8 @@
       </w:r>
       <w:proofErr w:type="spellEnd"/>
       <w:r>
-        <w:t xml:space="preserve"> &lt;- </w:t>
-      </w:r>
-      <w:proofErr w:type="gramStart"/>
-      <w:r>
-        <w:t>list(</w:t>
-      </w:r>
-      <w:proofErr w:type="gramEnd"/>
+        <w:t xml:space="preserve"> &lt;- list(</w:t>
+      </w:r>
     </w:p>
     <w:p>
       <w:r>
@@ -5148,13 +4902,740 @@
       </w:r>
       <w:proofErr w:type="spellEnd"/>
       <w:r>
+        <w:t xml:space="preserve"> = list(</w:t>
+      </w:r>
+    </w:p>
+    <w:p>
+      <w:r>
+        <w:t xml:space="preserve">    </w:t>
+      </w:r>
+      <w:proofErr w:type="spellStart"/>
+      <w:r>
+        <w:t>slCountry</w:t>
+      </w:r>
+      <w:proofErr w:type="spellEnd"/>
+      <w:r>
+        <w:t xml:space="preserve"> = list("ZW"),</w:t>
+      </w:r>
+    </w:p>
+    <w:p>
+      <w:r>
+        <w:t xml:space="preserve">    </w:t>
+      </w:r>
+      <w:proofErr w:type="spellStart"/>
+      <w:r>
+        <w:t>slYear</w:t>
+      </w:r>
+      <w:proofErr w:type="spellEnd"/>
+      <w:r>
+        <w:t xml:space="preserve"> = list("2024")</w:t>
+      </w:r>
+    </w:p>
+    <w:p>
+      <w:r>
+        <w:t xml:space="preserve">  )</w:t>
+      </w:r>
+    </w:p>
+    <w:p>
+      <w:r>
+        <w:t>)</w:t>
+      </w:r>
+    </w:p>
+    <w:p/>
+    <w:p>
+      <w:r>
+        <w:t># Download the data using the defined filter and save it to the specified directory</w:t>
+      </w:r>
+    </w:p>
+    <w:p>
+      <w:proofErr w:type="spellStart"/>
+      <w:r>
+        <w:t>zipfile</w:t>
+      </w:r>
+      <w:proofErr w:type="spellEnd"/>
+      <w:r>
+        <w:t xml:space="preserve"> &lt;- </w:t>
+      </w:r>
+      <w:proofErr w:type="spellStart"/>
+      <w:r>
+        <w:t>rdbes_download_data</w:t>
+      </w:r>
+      <w:proofErr w:type="spellEnd"/>
+      <w:r>
+        <w:t>(</w:t>
+      </w:r>
+      <w:proofErr w:type="spellStart"/>
+      <w:r>
+        <w:t>my_filter</w:t>
+      </w:r>
+      <w:proofErr w:type="spellEnd"/>
+      <w:r>
+        <w:t xml:space="preserve">, </w:t>
+      </w:r>
+      <w:proofErr w:type="spellStart"/>
+      <w:r>
+        <w:t>dest_dir</w:t>
+      </w:r>
+      <w:proofErr w:type="spellEnd"/>
+      <w:r>
         <w:t xml:space="preserve"> = </w:t>
       </w:r>
-      <w:proofErr w:type="gramStart"/>
-      <w:r>
-        <w:t>list(</w:t>
-      </w:r>
-      <w:proofErr w:type="gramEnd"/>
+      <w:proofErr w:type="spellStart"/>
+      <w:r>
+        <w:t>tempdir</w:t>
+      </w:r>
+      <w:proofErr w:type="spellEnd"/>
+      <w:r>
+        <w:t>())</w:t>
+      </w:r>
+    </w:p>
+    <w:p>
+      <w:r>
+        <w:t>## [201 Created] Create Export Job</w:t>
+      </w:r>
+    </w:p>
+    <w:p/>
+    <w:p>
+      <w:r>
+        <w:t>## Job ID: 75b9ce1b-f47a-4878-831b-0e753db54ddf. Polling for completion...</w:t>
+      </w:r>
+    </w:p>
+    <w:p/>
+    <w:p>
+      <w:r>
+        <w:t>## [200 OK] Check Status</w:t>
+      </w:r>
+    </w:p>
+    <w:p/>
+    <w:p>
+      <w:r>
+        <w:t>## Job Completed!</w:t>
+      </w:r>
+    </w:p>
+    <w:p/>
+    <w:p>
+      <w:r>
+        <w:t>## [200 OK] Download File</w:t>
+      </w:r>
+    </w:p>
+    <w:p/>
+    <w:p>
+      <w:r>
+        <w:t>## Process finished. File saved: /</w:t>
+      </w:r>
+      <w:proofErr w:type="spellStart"/>
+      <w:r>
+        <w:t>tmp</w:t>
+      </w:r>
+      <w:proofErr w:type="spellEnd"/>
+      <w:r>
+        <w:t>/RtmpF47iyo/export_75b9ce1b-f47a-4878-831b-0e753db54ddf.zip</w:t>
+      </w:r>
+    </w:p>
+    <w:p>
+      <w:r>
+        <w:t># list the contents of the downloaded ZIP file</w:t>
+      </w:r>
+    </w:p>
+    <w:p>
+      <w:r>
+        <w:t>unzip(</w:t>
+      </w:r>
+      <w:proofErr w:type="spellStart"/>
+      <w:r>
+        <w:t>zipfile</w:t>
+      </w:r>
+      <w:proofErr w:type="spellEnd"/>
+      <w:r>
+        <w:t>, list = TRUE)</w:t>
+      </w:r>
+    </w:p>
+    <w:p>
+      <w:r>
+        <w:t>##             Name Length                Date</w:t>
+      </w:r>
+    </w:p>
+    <w:p>
+      <w:r>
+        <w:t>## 1        HSL.csv      0 2026-05-13 13:36:00</w:t>
+      </w:r>
+    </w:p>
+    <w:p>
+      <w:r>
+        <w:t>## 2 Disclaimer.txt    810 2026-05-13 13:36:00</w:t>
+      </w:r>
+    </w:p>
+    <w:p>
+      <w:r>
+        <w:t># unzip into a folder called "</w:t>
+      </w:r>
+      <w:proofErr w:type="spellStart"/>
+      <w:r>
+        <w:t>rdbes</w:t>
+      </w:r>
+      <w:proofErr w:type="spellEnd"/>
+      <w:r>
+        <w:t>" in the current working directory</w:t>
+      </w:r>
+    </w:p>
+    <w:p>
+      <w:r>
+        <w:t>unzip(</w:t>
+      </w:r>
+      <w:proofErr w:type="spellStart"/>
+      <w:r>
+        <w:t>zipfile</w:t>
+      </w:r>
+      <w:proofErr w:type="spellEnd"/>
+      <w:r>
+        <w:t xml:space="preserve">, </w:t>
+      </w:r>
+      <w:proofErr w:type="spellStart"/>
+      <w:r>
+        <w:t>exdir</w:t>
+      </w:r>
+      <w:proofErr w:type="spellEnd"/>
+      <w:r>
+        <w:t xml:space="preserve"> = "</w:t>
+      </w:r>
+      <w:proofErr w:type="spellStart"/>
+      <w:r>
+        <w:t>rdbes</w:t>
+      </w:r>
+      <w:proofErr w:type="spellEnd"/>
+      <w:r>
+        <w:t>")</w:t>
+      </w:r>
+    </w:p>
+    <w:p/>
+    <w:p>
+      <w:r>
+        <w:t># read in csv file</w:t>
+      </w:r>
+    </w:p>
+    <w:p>
+      <w:r>
+        <w:t># ...</w:t>
+      </w:r>
+    </w:p>
+    <w:p>
+      <w:pPr>
+        <w:rPr>
+          <w:b/>
+          <w:bCs/>
+        </w:rPr>
+      </w:pPr>
+      <w:r>
+        <w:rPr>
+          <w:b/>
+          <w:bCs/>
+        </w:rPr>
+        <w:t>Using predefined filters</w:t>
+      </w:r>
+    </w:p>
+    <w:p>
+      <w:r>
+        <w:t>T</w:t>
+      </w:r>
+      <w:r>
+        <w:t xml:space="preserve">he </w:t>
+      </w:r>
+      <w:proofErr w:type="spellStart"/>
+      <w:r>
+        <w:t>icesRDBES</w:t>
+      </w:r>
+      <w:proofErr w:type="spellEnd"/>
+      <w:r>
+        <w:t xml:space="preserve"> package also provides predefined filters for each data type, which can be used to simplify the process of creating the filter list.</w:t>
+      </w:r>
+    </w:p>
+    <w:p>
+      <w:r>
+        <w:t>library(</w:t>
+      </w:r>
+      <w:proofErr w:type="spellStart"/>
+      <w:r>
+        <w:t>icesRDBES</w:t>
+      </w:r>
+      <w:proofErr w:type="spellEnd"/>
+      <w:r>
+        <w:t>)</w:t>
+      </w:r>
+    </w:p>
+    <w:p>
+      <w:r>
+        <w:t># see ?</w:t>
+      </w:r>
+      <w:proofErr w:type="spellStart"/>
+      <w:r>
+        <w:t>type_filters</w:t>
+      </w:r>
+      <w:proofErr w:type="spellEnd"/>
+    </w:p>
+    <w:p>
+      <w:r>
+        <w:t>names(</w:t>
+      </w:r>
+      <w:proofErr w:type="spellStart"/>
+      <w:r>
+        <w:t>type_filters</w:t>
+      </w:r>
+      <w:proofErr w:type="spellEnd"/>
+      <w:r>
+        <w:t>)</w:t>
+      </w:r>
+    </w:p>
+    <w:p>
+      <w:r>
+        <w:t>## [1] "CS" "CL" "CE" "SL" "VD"</w:t>
+      </w:r>
+    </w:p>
+    <w:p>
+      <w:proofErr w:type="spellStart"/>
+      <w:r>
+        <w:t>type_filters</w:t>
+      </w:r>
+      <w:proofErr w:type="spellEnd"/>
+      <w:r>
+        <w:t>[["CE"]]</w:t>
+      </w:r>
+    </w:p>
+    <w:p>
+      <w:r>
+        <w:t>## $hierarchies</w:t>
+      </w:r>
+    </w:p>
+    <w:p>
+      <w:r>
+        <w:t>## $hierarchies[[1]]</w:t>
+      </w:r>
+    </w:p>
+    <w:p>
+      <w:r>
+        <w:t>## [1] "HCE"</w:t>
+      </w:r>
+    </w:p>
+    <w:p>
+      <w:r>
+        <w:t xml:space="preserve">## </w:t>
+      </w:r>
+    </w:p>
+    <w:p>
+      <w:r>
+        <w:t xml:space="preserve">## </w:t>
+      </w:r>
+    </w:p>
+    <w:p>
+      <w:r>
+        <w:t>## $</w:t>
+      </w:r>
+      <w:proofErr w:type="spellStart"/>
+      <w:r>
+        <w:t>ceFilters</w:t>
+      </w:r>
+      <w:proofErr w:type="spellEnd"/>
+    </w:p>
+    <w:p>
+      <w:r>
+        <w:t>## $</w:t>
+      </w:r>
+      <w:proofErr w:type="spellStart"/>
+      <w:r>
+        <w:t>ceFilters$ceYear</w:t>
+      </w:r>
+      <w:proofErr w:type="spellEnd"/>
+    </w:p>
+    <w:p>
+      <w:r>
+        <w:t>## $</w:t>
+      </w:r>
+      <w:proofErr w:type="spellStart"/>
+      <w:r>
+        <w:t>ceFilters$ceYear</w:t>
+      </w:r>
+      <w:proofErr w:type="spellEnd"/>
+      <w:r>
+        <w:t>[[1]]</w:t>
+      </w:r>
+    </w:p>
+    <w:p>
+      <w:r>
+        <w:t>## [1] "2024"</w:t>
+      </w:r>
+    </w:p>
+    <w:p>
+      <w:r>
+        <w:t xml:space="preserve">## </w:t>
+      </w:r>
+    </w:p>
+    <w:p>
+      <w:r>
+        <w:t xml:space="preserve">## </w:t>
+      </w:r>
+    </w:p>
+    <w:p>
+      <w:r>
+        <w:t>## $</w:t>
+      </w:r>
+      <w:proofErr w:type="spellStart"/>
+      <w:r>
+        <w:t>ceFilters$ceVesselFlagCountry</w:t>
+      </w:r>
+      <w:proofErr w:type="spellEnd"/>
+    </w:p>
+    <w:p>
+      <w:r>
+        <w:t>## $</w:t>
+      </w:r>
+      <w:proofErr w:type="spellStart"/>
+      <w:r>
+        <w:t>ceFilters$ceVesselFlagCountry</w:t>
+      </w:r>
+      <w:proofErr w:type="spellEnd"/>
+      <w:r>
+        <w:t>[[1]]</w:t>
+      </w:r>
+    </w:p>
+    <w:p>
+      <w:r>
+        <w:t>## [1] "ZW"</w:t>
+      </w:r>
+    </w:p>
+    <w:p>
+      <w:r>
+        <w:t xml:space="preserve">## </w:t>
+      </w:r>
+    </w:p>
+    <w:p>
+      <w:r>
+        <w:t xml:space="preserve">## </w:t>
+      </w:r>
+    </w:p>
+    <w:p>
+      <w:r>
+        <w:t>## $</w:t>
+      </w:r>
+      <w:proofErr w:type="spellStart"/>
+      <w:r>
+        <w:t>ceFilters$ceArea</w:t>
+      </w:r>
+      <w:proofErr w:type="spellEnd"/>
+    </w:p>
+    <w:p>
+      <w:r>
+        <w:lastRenderedPageBreak/>
+        <w:t>## list()</w:t>
+      </w:r>
+    </w:p>
+    <w:p>
+      <w:r>
+        <w:t>A more complex example using the predefined filters for each data type could look like this:</w:t>
+      </w:r>
+    </w:p>
+    <w:p>
+      <w:r>
+        <w:t>library(</w:t>
+      </w:r>
+      <w:proofErr w:type="spellStart"/>
+      <w:r>
+        <w:t>icesRDBES</w:t>
+      </w:r>
+      <w:proofErr w:type="spellEnd"/>
+      <w:r>
+        <w:t>)</w:t>
+      </w:r>
+    </w:p>
+    <w:p/>
+    <w:p>
+      <w:proofErr w:type="spellStart"/>
+      <w:r>
+        <w:t>selected_type</w:t>
+      </w:r>
+      <w:proofErr w:type="spellEnd"/>
+      <w:r>
+        <w:t xml:space="preserve">   &lt;- "CL"              # Options: "CS", "CL", "CE", "SL", "VD"</w:t>
+      </w:r>
+    </w:p>
+    <w:p>
+      <w:proofErr w:type="spellStart"/>
+      <w:r>
+        <w:t>selected_format</w:t>
+      </w:r>
+      <w:proofErr w:type="spellEnd"/>
+      <w:r>
+        <w:t xml:space="preserve"> &lt;- "</w:t>
+      </w:r>
+      <w:proofErr w:type="spellStart"/>
+      <w:r>
+        <w:t>SingleCsvFile</w:t>
+      </w:r>
+      <w:proofErr w:type="spellEnd"/>
+      <w:r>
+        <w:t>"   # Options: "</w:t>
+      </w:r>
+      <w:proofErr w:type="spellStart"/>
+      <w:r>
+        <w:t>SingleCsvFile</w:t>
+      </w:r>
+      <w:proofErr w:type="spellEnd"/>
+      <w:r>
+        <w:t>", "</w:t>
+      </w:r>
+      <w:proofErr w:type="spellStart"/>
+      <w:r>
+        <w:t>CsvFilePerTable</w:t>
+      </w:r>
+      <w:proofErr w:type="spellEnd"/>
+      <w:r>
+        <w:t>"</w:t>
+      </w:r>
+    </w:p>
+    <w:p>
+      <w:proofErr w:type="spellStart"/>
+      <w:r>
+        <w:t>selected_filter</w:t>
+      </w:r>
+      <w:proofErr w:type="spellEnd"/>
+      <w:r>
+        <w:t xml:space="preserve"> &lt;- </w:t>
+      </w:r>
+      <w:proofErr w:type="spellStart"/>
+      <w:r>
+        <w:t>type_filters</w:t>
+      </w:r>
+      <w:proofErr w:type="spellEnd"/>
+      <w:r>
+        <w:t>[[</w:t>
+      </w:r>
+      <w:proofErr w:type="spellStart"/>
+      <w:r>
+        <w:t>selected_type</w:t>
+      </w:r>
+      <w:proofErr w:type="spellEnd"/>
+      <w:r>
+        <w:t>]]</w:t>
+      </w:r>
+    </w:p>
+    <w:p/>
+    <w:p>
+      <w:r>
+        <w:t># modify the filter here if needed, e.g. to add a species code filter</w:t>
+      </w:r>
+    </w:p>
+    <w:p>
+      <w:proofErr w:type="spellStart"/>
+      <w:r>
+        <w:t>selected_filter</w:t>
+      </w:r>
+      <w:proofErr w:type="spellEnd"/>
+    </w:p>
+    <w:p>
+      <w:r>
+        <w:t>## $hierarchies</w:t>
+      </w:r>
+    </w:p>
+    <w:p>
+      <w:r>
+        <w:t>## $hierarchies[[1]]</w:t>
+      </w:r>
+    </w:p>
+    <w:p>
+      <w:r>
+        <w:t>## [1] "HCL"</w:t>
+      </w:r>
+    </w:p>
+    <w:p>
+      <w:r>
+        <w:t xml:space="preserve">## </w:t>
+      </w:r>
+    </w:p>
+    <w:p>
+      <w:r>
+        <w:t xml:space="preserve">## </w:t>
+      </w:r>
+    </w:p>
+    <w:p>
+      <w:r>
+        <w:t>## $</w:t>
+      </w:r>
+      <w:proofErr w:type="spellStart"/>
+      <w:r>
+        <w:t>clFilters</w:t>
+      </w:r>
+      <w:proofErr w:type="spellEnd"/>
+    </w:p>
+    <w:p>
+      <w:r>
+        <w:t>## $</w:t>
+      </w:r>
+      <w:proofErr w:type="spellStart"/>
+      <w:r>
+        <w:t>clFilters$clYear</w:t>
+      </w:r>
+      <w:proofErr w:type="spellEnd"/>
+    </w:p>
+    <w:p>
+      <w:r>
+        <w:t>## $</w:t>
+      </w:r>
+      <w:proofErr w:type="spellStart"/>
+      <w:r>
+        <w:t>clFilters$clYear</w:t>
+      </w:r>
+      <w:proofErr w:type="spellEnd"/>
+      <w:r>
+        <w:t>[[1]]</w:t>
+      </w:r>
+    </w:p>
+    <w:p>
+      <w:r>
+        <w:t>## [1] "2024"</w:t>
+      </w:r>
+    </w:p>
+    <w:p>
+      <w:r>
+        <w:t xml:space="preserve">## </w:t>
+      </w:r>
+    </w:p>
+    <w:p>
+      <w:r>
+        <w:t xml:space="preserve">## </w:t>
+      </w:r>
+    </w:p>
+    <w:p>
+      <w:r>
+        <w:t>## $</w:t>
+      </w:r>
+      <w:proofErr w:type="spellStart"/>
+      <w:r>
+        <w:t>clFilters$clVesselFlagCountry</w:t>
+      </w:r>
+      <w:proofErr w:type="spellEnd"/>
+    </w:p>
+    <w:p>
+      <w:r>
+        <w:t>## $</w:t>
+      </w:r>
+      <w:proofErr w:type="spellStart"/>
+      <w:r>
+        <w:t>clFilters$clVesselFlagCountry</w:t>
+      </w:r>
+      <w:proofErr w:type="spellEnd"/>
+      <w:r>
+        <w:t>[[1]]</w:t>
+      </w:r>
+    </w:p>
+    <w:p>
+      <w:r>
+        <w:t>## [1] "ZW"</w:t>
+      </w:r>
+    </w:p>
+    <w:p>
+      <w:r>
+        <w:t xml:space="preserve">## </w:t>
+      </w:r>
+    </w:p>
+    <w:p>
+      <w:r>
+        <w:t xml:space="preserve">## </w:t>
+      </w:r>
+    </w:p>
+    <w:p>
+      <w:r>
+        <w:t>## $</w:t>
+      </w:r>
+      <w:proofErr w:type="spellStart"/>
+      <w:r>
+        <w:t>clFilters$clArea</w:t>
+      </w:r>
+      <w:proofErr w:type="spellEnd"/>
+    </w:p>
+    <w:p>
+      <w:r>
+        <w:lastRenderedPageBreak/>
+        <w:t>## list()</w:t>
+      </w:r>
+    </w:p>
+    <w:p>
+      <w:r>
+        <w:t xml:space="preserve">## </w:t>
+      </w:r>
+    </w:p>
+    <w:p>
+      <w:r>
+        <w:t>## $</w:t>
+      </w:r>
+      <w:proofErr w:type="spellStart"/>
+      <w:r>
+        <w:t>clFilters$clSpeciesCode</w:t>
+      </w:r>
+      <w:proofErr w:type="spellEnd"/>
+    </w:p>
+    <w:p>
+      <w:r>
+        <w:t>## list()</w:t>
+      </w:r>
+    </w:p>
+    <w:p>
+      <w:r>
+        <w:t># 1. Initialize filter with constant parameters</w:t>
+      </w:r>
+    </w:p>
+    <w:p>
+      <w:proofErr w:type="spellStart"/>
+      <w:r>
+        <w:t>my_filter</w:t>
+      </w:r>
+      <w:proofErr w:type="spellEnd"/>
+      <w:r>
+        <w:t xml:space="preserve"> &lt;-</w:t>
+      </w:r>
+    </w:p>
+    <w:p>
+      <w:r>
+        <w:t xml:space="preserve">  c(</w:t>
+      </w:r>
+    </w:p>
+    <w:p>
+      <w:r>
+        <w:t xml:space="preserve">    list(</w:t>
+      </w:r>
+    </w:p>
+    <w:p>
+      <w:r>
+        <w:t xml:space="preserve">      </w:t>
+      </w:r>
+      <w:proofErr w:type="spellStart"/>
+      <w:r>
+        <w:t>dataType</w:t>
+      </w:r>
+      <w:proofErr w:type="spellEnd"/>
+      <w:r>
+        <w:t xml:space="preserve">          = </w:t>
+      </w:r>
+      <w:proofErr w:type="spellStart"/>
+      <w:r>
+        <w:t>selected_type</w:t>
+      </w:r>
+      <w:proofErr w:type="spellEnd"/>
+      <w:r>
+        <w:t>,</w:t>
+      </w:r>
+    </w:p>
+    <w:p>
+      <w:r>
+        <w:t xml:space="preserve">      format            = </w:t>
+      </w:r>
+      <w:proofErr w:type="spellStart"/>
+      <w:r>
+        <w:t>selected_format</w:t>
+      </w:r>
+      <w:proofErr w:type="spellEnd"/>
+    </w:p>
+    <w:p>
+      <w:r>
+        <w:t xml:space="preserve">    ),</w:t>
+      </w:r>
     </w:p>
     <w:p>
       <w:r>
@@ -5162,75 +5643,152 @@
       </w:r>
       <w:proofErr w:type="spellStart"/>
       <w:r>
-        <w:t>slCountry</w:t>
-      </w:r>
-      <w:proofErr w:type="spellEnd"/>
-      <w:r>
-        <w:t xml:space="preserve"> = list("ZW"),</w:t>
-      </w:r>
-    </w:p>
-    <w:p>
-      <w:r>
-        <w:t xml:space="preserve">    </w:t>
-      </w:r>
-      <w:proofErr w:type="spellStart"/>
-      <w:r>
-        <w:t>slYear</w:t>
+        <w:t>selected_filter</w:t>
+      </w:r>
+      <w:proofErr w:type="spellEnd"/>
+    </w:p>
+    <w:p>
+      <w:r>
+        <w:t xml:space="preserve">  )</w:t>
+      </w:r>
+    </w:p>
+    <w:p/>
+    <w:p>
+      <w:r>
+        <w:t># 3. Execute</w:t>
+      </w:r>
+    </w:p>
+    <w:p>
+      <w:proofErr w:type="spellStart"/>
+      <w:r>
+        <w:t>zipfile</w:t>
+      </w:r>
+      <w:proofErr w:type="spellEnd"/>
+      <w:r>
+        <w:t xml:space="preserve"> &lt;- </w:t>
+      </w:r>
+      <w:proofErr w:type="spellStart"/>
+      <w:r>
+        <w:t>rdbes_download_data</w:t>
+      </w:r>
+      <w:proofErr w:type="spellEnd"/>
+      <w:r>
+        <w:t xml:space="preserve">(payload = </w:t>
+      </w:r>
+      <w:proofErr w:type="spellStart"/>
+      <w:r>
+        <w:t>my_filter</w:t>
+      </w:r>
+      <w:proofErr w:type="spellEnd"/>
+      <w:r>
+        <w:t xml:space="preserve">, </w:t>
+      </w:r>
+      <w:proofErr w:type="spellStart"/>
+      <w:r>
+        <w:t>dest_dir</w:t>
       </w:r>
       <w:proofErr w:type="spellEnd"/>
       <w:r>
         <w:t xml:space="preserve"> = </w:t>
       </w:r>
-      <w:proofErr w:type="gramStart"/>
-      <w:r>
-        <w:t>list(</w:t>
-      </w:r>
-      <w:proofErr w:type="gramEnd"/>
-      <w:r>
-        <w:t>"2024")</w:t>
-      </w:r>
-    </w:p>
-    <w:p>
-      <w:r>
-        <w:t xml:space="preserve">  )</w:t>
-      </w:r>
-    </w:p>
-    <w:p>
-      <w:r>
-        <w:t>)</w:t>
+      <w:proofErr w:type="spellStart"/>
+      <w:r>
+        <w:t>tempdir</w:t>
+      </w:r>
+      <w:proofErr w:type="spellEnd"/>
+      <w:r>
+        <w:t>())</w:t>
+      </w:r>
+    </w:p>
+    <w:p>
+      <w:r>
+        <w:t>## [201 Created] Create Export Job</w:t>
       </w:r>
     </w:p>
     <w:p/>
     <w:p>
       <w:r>
-        <w:t># Download the data using the defined filter and save it to the specified directory</w:t>
-      </w:r>
-    </w:p>
-    <w:p>
+        <w:t>## Job ID: 54d1e521-1aa1-4fc0-83dd-6a000df1d798. Polling for completion...</w:t>
+      </w:r>
+    </w:p>
+    <w:p/>
+    <w:p>
+      <w:r>
+        <w:t>## [200 OK] Check Status</w:t>
+      </w:r>
+    </w:p>
+    <w:p/>
+    <w:p>
+      <w:r>
+        <w:t>## Job Completed!</w:t>
+      </w:r>
+    </w:p>
+    <w:p/>
+    <w:p>
+      <w:r>
+        <w:t>## [200 OK] Download File</w:t>
+      </w:r>
+    </w:p>
+    <w:p/>
+    <w:p>
+      <w:r>
+        <w:t>## Process finished. File saved: /</w:t>
+      </w:r>
+      <w:proofErr w:type="spellStart"/>
+      <w:r>
+        <w:t>tmp</w:t>
+      </w:r>
+      <w:proofErr w:type="spellEnd"/>
+      <w:r>
+        <w:t>/RtmpF47iyo/export_54d1e521-1aa1-4fc0-83dd-6a000df1d798.zip</w:t>
+      </w:r>
+    </w:p>
+    <w:p>
+      <w:r>
+        <w:lastRenderedPageBreak/>
+        <w:t># list the contents of the downloaded ZIP file</w:t>
+      </w:r>
+    </w:p>
+    <w:p>
+      <w:r>
+        <w:t>unzip(</w:t>
+      </w:r>
       <w:proofErr w:type="spellStart"/>
       <w:r>
         <w:t>zipfile</w:t>
       </w:r>
       <w:proofErr w:type="spellEnd"/>
       <w:r>
-        <w:t xml:space="preserve"> &lt;- </w:t>
-      </w:r>
-      <w:proofErr w:type="spellStart"/>
-      <w:r>
-        <w:t>rdbes_download_</w:t>
-      </w:r>
-      <w:proofErr w:type="gramStart"/>
-      <w:r>
-        <w:t>data</w:t>
-      </w:r>
-      <w:proofErr w:type="spellEnd"/>
-      <w:r>
-        <w:t>(</w:t>
-      </w:r>
-      <w:proofErr w:type="spellStart"/>
-      <w:proofErr w:type="gramEnd"/>
-      <w:r>
-        <w:t>my_filter</w:t>
+        <w:t>, list = TRUE)</w:t>
+      </w:r>
+    </w:p>
+    <w:p>
+      <w:r>
+        <w:t>##             Name Length                Date</w:t>
+      </w:r>
+    </w:p>
+    <w:p>
+      <w:r>
+        <w:t>## 1        HCL.csv    898 2026-05-13 13:36:00</w:t>
+      </w:r>
+    </w:p>
+    <w:p>
+      <w:r>
+        <w:t>## 2 Disclaimer.txt    810 2026-05-13 13:36:00</w:t>
+      </w:r>
+    </w:p>
+    <w:p>
+      <w:r>
+        <w:t># list the contents of the downloaded ZIP file to local directory</w:t>
+      </w:r>
+    </w:p>
+    <w:p>
+      <w:r>
+        <w:t>unzip(</w:t>
+      </w:r>
+      <w:proofErr w:type="spellStart"/>
+      <w:r>
+        <w:t>zipfile</w:t>
       </w:r>
       <w:proofErr w:type="spellEnd"/>
       <w:r>
@@ -5238,115 +5796,11 @@
       </w:r>
       <w:proofErr w:type="spellStart"/>
       <w:r>
-        <w:t>dest_dir</w:t>
-      </w:r>
-      <w:proofErr w:type="spellEnd"/>
-      <w:r>
-        <w:t xml:space="preserve"> = </w:t>
-      </w:r>
-      <w:proofErr w:type="spellStart"/>
-      <w:proofErr w:type="gramStart"/>
-      <w:r>
-        <w:t>tempdir</w:t>
-      </w:r>
-      <w:proofErr w:type="spellEnd"/>
-      <w:r>
-        <w:t>(</w:t>
-      </w:r>
-      <w:proofErr w:type="gramEnd"/>
-      <w:r>
-        <w:t>))</w:t>
-      </w:r>
-    </w:p>
-    <w:p>
-      <w:r>
-        <w:t>## [201 Created] Create Export Job</w:t>
-      </w:r>
-    </w:p>
-    <w:p/>
-    <w:p>
-      <w:r>
-        <w:t>## Job ID: 75b9ce1b-f47a-4878-831b-0e753db54ddf. Polling for completion...</w:t>
-      </w:r>
-    </w:p>
-    <w:p/>
-    <w:p>
-      <w:r>
-        <w:t>## [200 OK] Check Status</w:t>
-      </w:r>
-    </w:p>
-    <w:p/>
-    <w:p>
-      <w:r>
-        <w:t>## Job Completed!</w:t>
-      </w:r>
-    </w:p>
-    <w:p/>
-    <w:p>
-      <w:r>
-        <w:t>## [200 OK] Download File</w:t>
-      </w:r>
-    </w:p>
-    <w:p/>
-    <w:p>
-      <w:r>
-        <w:t>## Process finished. File saved: /</w:t>
-      </w:r>
-      <w:proofErr w:type="spellStart"/>
-      <w:r>
-        <w:t>tmp</w:t>
-      </w:r>
-      <w:proofErr w:type="spellEnd"/>
-      <w:r>
-        <w:t>/RtmpF47iyo/export_75b9ce1b-f47a-4878-831b-0e753db54ddf.zip</w:t>
-      </w:r>
-    </w:p>
-    <w:p>
-      <w:r>
-        <w:t xml:space="preserve"># </w:t>
-      </w:r>
-      <w:proofErr w:type="gramStart"/>
-      <w:r>
-        <w:t>list</w:t>
-      </w:r>
-      <w:proofErr w:type="gramEnd"/>
-      <w:r>
-        <w:t xml:space="preserve"> the contents of the downloaded ZIP file</w:t>
-      </w:r>
-    </w:p>
-    <w:p>
-      <w:proofErr w:type="gramStart"/>
-      <w:r>
-        <w:t>unzip(</w:t>
-      </w:r>
-      <w:proofErr w:type="spellStart"/>
-      <w:proofErr w:type="gramEnd"/>
-      <w:r>
-        <w:t>zipfile</w:t>
-      </w:r>
-      <w:proofErr w:type="spellEnd"/>
-      <w:r>
-        <w:t>, list = TRUE)</w:t>
-      </w:r>
-    </w:p>
-    <w:p>
-      <w:r>
-        <w:t>##             Name Length                Date</w:t>
-      </w:r>
-    </w:p>
-    <w:p>
-      <w:r>
-        <w:t>## 1        HSL.csv      0 2026-05-13 13:36:00</w:t>
-      </w:r>
-    </w:p>
-    <w:p>
-      <w:r>
-        <w:t>## 2 Disclaimer.txt    810 2026-05-13 13:36:00</w:t>
-      </w:r>
-    </w:p>
-    <w:p>
-      <w:r>
-        <w:t># unzip into a folder called "</w:t>
+        <w:t>exdir</w:t>
+      </w:r>
+      <w:proofErr w:type="spellEnd"/>
+      <w:r>
+        <w:t xml:space="preserve"> = "</w:t>
       </w:r>
       <w:proofErr w:type="spellStart"/>
       <w:r>
@@ -5354,883 +5808,9 @@
       </w:r>
       <w:proofErr w:type="spellEnd"/>
       <w:r>
-        <w:t>" in the current working directory</w:t>
-      </w:r>
-    </w:p>
-    <w:p>
-      <w:proofErr w:type="gramStart"/>
-      <w:r>
-        <w:t>unzip(</w:t>
-      </w:r>
-      <w:proofErr w:type="spellStart"/>
-      <w:proofErr w:type="gramEnd"/>
-      <w:r>
-        <w:t>zipfile</w:t>
-      </w:r>
-      <w:proofErr w:type="spellEnd"/>
-      <w:r>
-        <w:t xml:space="preserve">, </w:t>
-      </w:r>
-      <w:proofErr w:type="spellStart"/>
-      <w:r>
-        <w:t>exdir</w:t>
-      </w:r>
-      <w:proofErr w:type="spellEnd"/>
-      <w:r>
-        <w:t xml:space="preserve"> = "</w:t>
-      </w:r>
-      <w:proofErr w:type="spellStart"/>
-      <w:r>
-        <w:t>rdbes</w:t>
-      </w:r>
-      <w:proofErr w:type="spellEnd"/>
-      <w:r>
         <w:t>")</w:t>
       </w:r>
     </w:p>
-    <w:p/>
-    <w:p>
-      <w:r>
-        <w:t xml:space="preserve"># </w:t>
-      </w:r>
-      <w:proofErr w:type="gramStart"/>
-      <w:r>
-        <w:t>read</w:t>
-      </w:r>
-      <w:proofErr w:type="gramEnd"/>
-      <w:r>
-        <w:t xml:space="preserve"> in csv file</w:t>
-      </w:r>
-    </w:p>
-    <w:p>
-      <w:r>
-        <w:t># ...</w:t>
-      </w:r>
-    </w:p>
-    <w:p>
-      <w:pPr>
-        <w:rPr>
-          <w:b/>
-          <w:bCs/>
-        </w:rPr>
-      </w:pPr>
-      <w:r>
-        <w:rPr>
-          <w:b/>
-          <w:bCs/>
-        </w:rPr>
-        <w:t>Using predefined filters</w:t>
-      </w:r>
-    </w:p>
-    <w:p>
-      <w:r>
-        <w:t>T</w:t>
-      </w:r>
-      <w:r>
-        <w:t xml:space="preserve">he </w:t>
-      </w:r>
-      <w:proofErr w:type="spellStart"/>
-      <w:r>
-        <w:t>icesRDBES</w:t>
-      </w:r>
-      <w:proofErr w:type="spellEnd"/>
-      <w:r>
-        <w:t xml:space="preserve"> package also provides predefined filters for each data type, which can be used to simplify the process of creating the filter list.</w:t>
-      </w:r>
-    </w:p>
-    <w:p>
-      <w:r>
-        <w:t>library(</w:t>
-      </w:r>
-      <w:proofErr w:type="spellStart"/>
-      <w:r>
-        <w:t>icesRDBES</w:t>
-      </w:r>
-      <w:proofErr w:type="spellEnd"/>
-      <w:r>
-        <w:t>)</w:t>
-      </w:r>
-    </w:p>
-    <w:p>
-      <w:r>
-        <w:t xml:space="preserve"># </w:t>
-      </w:r>
-      <w:proofErr w:type="gramStart"/>
-      <w:r>
-        <w:t>see ?</w:t>
-      </w:r>
-      <w:proofErr w:type="spellStart"/>
-      <w:r>
-        <w:t>type</w:t>
-      </w:r>
-      <w:proofErr w:type="gramEnd"/>
-      <w:r>
-        <w:t>_filters</w:t>
-      </w:r>
-      <w:proofErr w:type="spellEnd"/>
-    </w:p>
-    <w:p>
-      <w:r>
-        <w:t>names(</w:t>
-      </w:r>
-      <w:proofErr w:type="spellStart"/>
-      <w:r>
-        <w:t>type_filters</w:t>
-      </w:r>
-      <w:proofErr w:type="spellEnd"/>
-      <w:r>
-        <w:t>)</w:t>
-      </w:r>
-    </w:p>
-    <w:p>
-      <w:r>
-        <w:t>## [1] "CS" "CL" "CE" "SL" "VD"</w:t>
-      </w:r>
-    </w:p>
-    <w:p>
-      <w:proofErr w:type="spellStart"/>
-      <w:r>
-        <w:t>type_filters</w:t>
-      </w:r>
-      <w:proofErr w:type="spellEnd"/>
-      <w:r>
-        <w:t>[["CE"]]</w:t>
-      </w:r>
-    </w:p>
-    <w:p>
-      <w:r>
-        <w:t>## $hierarchies</w:t>
-      </w:r>
-    </w:p>
-    <w:p>
-      <w:r>
-        <w:t>## $</w:t>
-      </w:r>
-      <w:proofErr w:type="gramStart"/>
-      <w:r>
-        <w:t>hierarchies[</w:t>
-      </w:r>
-      <w:proofErr w:type="gramEnd"/>
-      <w:r>
-        <w:t>[1]]</w:t>
-      </w:r>
-    </w:p>
-    <w:p>
-      <w:r>
-        <w:t>## [1] "HCE"</w:t>
-      </w:r>
-    </w:p>
-    <w:p>
-      <w:r>
-        <w:t xml:space="preserve">## </w:t>
-      </w:r>
-    </w:p>
-    <w:p>
-      <w:r>
-        <w:t xml:space="preserve">## </w:t>
-      </w:r>
-    </w:p>
-    <w:p>
-      <w:r>
-        <w:t>## $</w:t>
-      </w:r>
-      <w:proofErr w:type="spellStart"/>
-      <w:r>
-        <w:t>ceFilters</w:t>
-      </w:r>
-      <w:proofErr w:type="spellEnd"/>
-    </w:p>
-    <w:p>
-      <w:r>
-        <w:t>## $</w:t>
-      </w:r>
-      <w:proofErr w:type="spellStart"/>
-      <w:r>
-        <w:t>ceFilters$ceYear</w:t>
-      </w:r>
-      <w:proofErr w:type="spellEnd"/>
-    </w:p>
-    <w:p>
-      <w:r>
-        <w:t>## $</w:t>
-      </w:r>
-      <w:proofErr w:type="spellStart"/>
-      <w:r>
-        <w:t>ceFilters$</w:t>
-      </w:r>
-      <w:proofErr w:type="gramStart"/>
-      <w:r>
-        <w:t>ceYear</w:t>
-      </w:r>
-      <w:proofErr w:type="spellEnd"/>
-      <w:r>
-        <w:t>[</w:t>
-      </w:r>
-      <w:proofErr w:type="gramEnd"/>
-      <w:r>
-        <w:t>[1]]</w:t>
-      </w:r>
-    </w:p>
-    <w:p>
-      <w:r>
-        <w:t>## [1] "2024"</w:t>
-      </w:r>
-    </w:p>
-    <w:p>
-      <w:r>
-        <w:t xml:space="preserve">## </w:t>
-      </w:r>
-    </w:p>
-    <w:p>
-      <w:r>
-        <w:t xml:space="preserve">## </w:t>
-      </w:r>
-    </w:p>
-    <w:p>
-      <w:r>
-        <w:t>## $</w:t>
-      </w:r>
-      <w:proofErr w:type="spellStart"/>
-      <w:r>
-        <w:t>ceFilters$ceVesselFlagCountry</w:t>
-      </w:r>
-      <w:proofErr w:type="spellEnd"/>
-    </w:p>
-    <w:p>
-      <w:r>
-        <w:t>## $</w:t>
-      </w:r>
-      <w:proofErr w:type="spellStart"/>
-      <w:r>
-        <w:t>ceFilters$</w:t>
-      </w:r>
-      <w:proofErr w:type="gramStart"/>
-      <w:r>
-        <w:t>ceVesselFlagCountry</w:t>
-      </w:r>
-      <w:proofErr w:type="spellEnd"/>
-      <w:r>
-        <w:t>[</w:t>
-      </w:r>
-      <w:proofErr w:type="gramEnd"/>
-      <w:r>
-        <w:t>[1]]</w:t>
-      </w:r>
-    </w:p>
-    <w:p>
-      <w:r>
-        <w:t>## [1] "ZW"</w:t>
-      </w:r>
-    </w:p>
-    <w:p>
-      <w:r>
-        <w:t xml:space="preserve">## </w:t>
-      </w:r>
-    </w:p>
-    <w:p>
-      <w:r>
-        <w:t xml:space="preserve">## </w:t>
-      </w:r>
-    </w:p>
-    <w:p>
-      <w:r>
-        <w:t>## $</w:t>
-      </w:r>
-      <w:proofErr w:type="spellStart"/>
-      <w:r>
-        <w:t>ceFilters$ceArea</w:t>
-      </w:r>
-      <w:proofErr w:type="spellEnd"/>
-    </w:p>
-    <w:p>
-      <w:r>
-        <w:lastRenderedPageBreak/>
-        <w:t xml:space="preserve">## </w:t>
-      </w:r>
-      <w:proofErr w:type="gramStart"/>
-      <w:r>
-        <w:t>list(</w:t>
-      </w:r>
-      <w:proofErr w:type="gramEnd"/>
-      <w:r>
-        <w:t>)</w:t>
-      </w:r>
-    </w:p>
-    <w:p>
-      <w:r>
-        <w:t>A more complex example using the predefined filters for each data type could look like this:</w:t>
-      </w:r>
-    </w:p>
-    <w:p>
-      <w:r>
-        <w:t>library(</w:t>
-      </w:r>
-      <w:proofErr w:type="spellStart"/>
-      <w:r>
-        <w:t>icesRDBES</w:t>
-      </w:r>
-      <w:proofErr w:type="spellEnd"/>
-      <w:r>
-        <w:t>)</w:t>
-      </w:r>
-    </w:p>
-    <w:p/>
-    <w:p>
-      <w:proofErr w:type="spellStart"/>
-      <w:r>
-        <w:t>selected_type</w:t>
-      </w:r>
-      <w:proofErr w:type="spellEnd"/>
-      <w:r>
-        <w:t xml:space="preserve">   &lt;- "CL"              # Options: "CS", "CL", "CE", "SL", "VD"</w:t>
-      </w:r>
-    </w:p>
-    <w:p>
-      <w:proofErr w:type="spellStart"/>
-      <w:r>
-        <w:t>selected_format</w:t>
-      </w:r>
-      <w:proofErr w:type="spellEnd"/>
-      <w:r>
-        <w:t xml:space="preserve"> &lt;- "</w:t>
-      </w:r>
-      <w:proofErr w:type="spellStart"/>
-      <w:r>
-        <w:t>SingleCsvFile</w:t>
-      </w:r>
-      <w:proofErr w:type="spellEnd"/>
-      <w:r>
-        <w:t>"   # Options: "</w:t>
-      </w:r>
-      <w:proofErr w:type="spellStart"/>
-      <w:r>
-        <w:t>SingleCsvFile</w:t>
-      </w:r>
-      <w:proofErr w:type="spellEnd"/>
-      <w:r>
-        <w:t>", "</w:t>
-      </w:r>
-      <w:proofErr w:type="spellStart"/>
-      <w:r>
-        <w:t>CsvFilePerTable</w:t>
-      </w:r>
-      <w:proofErr w:type="spellEnd"/>
-      <w:r>
-        <w:t>"</w:t>
-      </w:r>
-    </w:p>
-    <w:p>
-      <w:proofErr w:type="spellStart"/>
-      <w:r>
-        <w:t>selected_filter</w:t>
-      </w:r>
-      <w:proofErr w:type="spellEnd"/>
-      <w:r>
-        <w:t xml:space="preserve"> &lt;- </w:t>
-      </w:r>
-      <w:proofErr w:type="spellStart"/>
-      <w:r>
-        <w:t>type_filters</w:t>
-      </w:r>
-      <w:proofErr w:type="spellEnd"/>
-      <w:r>
-        <w:t>[[</w:t>
-      </w:r>
-      <w:proofErr w:type="spellStart"/>
-      <w:r>
-        <w:t>selected_type</w:t>
-      </w:r>
-      <w:proofErr w:type="spellEnd"/>
-      <w:r>
-        <w:t>]]</w:t>
-      </w:r>
-    </w:p>
-    <w:p/>
-    <w:p>
-      <w:r>
-        <w:t xml:space="preserve"># </w:t>
-      </w:r>
-      <w:proofErr w:type="gramStart"/>
-      <w:r>
-        <w:t>modify</w:t>
-      </w:r>
-      <w:proofErr w:type="gramEnd"/>
-      <w:r>
-        <w:t xml:space="preserve"> the filter here if needed, e.g. to add a species code filter</w:t>
-      </w:r>
-    </w:p>
-    <w:p>
-      <w:proofErr w:type="spellStart"/>
-      <w:r>
-        <w:t>selected_filter</w:t>
-      </w:r>
-      <w:proofErr w:type="spellEnd"/>
-    </w:p>
-    <w:p>
-      <w:r>
-        <w:t>## $hierarchies</w:t>
-      </w:r>
-    </w:p>
-    <w:p>
-      <w:r>
-        <w:t>## $</w:t>
-      </w:r>
-      <w:proofErr w:type="gramStart"/>
-      <w:r>
-        <w:t>hierarchies[</w:t>
-      </w:r>
-      <w:proofErr w:type="gramEnd"/>
-      <w:r>
-        <w:t>[1]]</w:t>
-      </w:r>
-    </w:p>
-    <w:p>
-      <w:r>
-        <w:t>## [1] "HCL"</w:t>
-      </w:r>
-    </w:p>
-    <w:p>
-      <w:r>
-        <w:t xml:space="preserve">## </w:t>
-      </w:r>
-    </w:p>
-    <w:p>
-      <w:r>
-        <w:t xml:space="preserve">## </w:t>
-      </w:r>
-    </w:p>
-    <w:p>
-      <w:r>
-        <w:t>## $</w:t>
-      </w:r>
-      <w:proofErr w:type="spellStart"/>
-      <w:r>
-        <w:t>clFilters</w:t>
-      </w:r>
-      <w:proofErr w:type="spellEnd"/>
-    </w:p>
-    <w:p>
-      <w:r>
-        <w:t>## $</w:t>
-      </w:r>
-      <w:proofErr w:type="spellStart"/>
-      <w:r>
-        <w:t>clFilters$clYear</w:t>
-      </w:r>
-      <w:proofErr w:type="spellEnd"/>
-    </w:p>
-    <w:p>
-      <w:r>
-        <w:t>## $</w:t>
-      </w:r>
-      <w:proofErr w:type="spellStart"/>
-      <w:r>
-        <w:t>clFilters$</w:t>
-      </w:r>
-      <w:proofErr w:type="gramStart"/>
-      <w:r>
-        <w:t>clYear</w:t>
-      </w:r>
-      <w:proofErr w:type="spellEnd"/>
-      <w:r>
-        <w:t>[</w:t>
-      </w:r>
-      <w:proofErr w:type="gramEnd"/>
-      <w:r>
-        <w:t>[1]]</w:t>
-      </w:r>
-    </w:p>
-    <w:p>
-      <w:r>
-        <w:t>## [1] "2024"</w:t>
-      </w:r>
-    </w:p>
-    <w:p>
-      <w:r>
-        <w:t xml:space="preserve">## </w:t>
-      </w:r>
-    </w:p>
-    <w:p>
-      <w:r>
-        <w:t xml:space="preserve">## </w:t>
-      </w:r>
-    </w:p>
-    <w:p>
-      <w:r>
-        <w:t>## $</w:t>
-      </w:r>
-      <w:proofErr w:type="spellStart"/>
-      <w:r>
-        <w:t>clFilters$clVesselFlagCountry</w:t>
-      </w:r>
-      <w:proofErr w:type="spellEnd"/>
-    </w:p>
-    <w:p>
-      <w:r>
-        <w:t>## $</w:t>
-      </w:r>
-      <w:proofErr w:type="spellStart"/>
-      <w:r>
-        <w:t>clFilters$</w:t>
-      </w:r>
-      <w:proofErr w:type="gramStart"/>
-      <w:r>
-        <w:t>clVesselFlagCountry</w:t>
-      </w:r>
-      <w:proofErr w:type="spellEnd"/>
-      <w:r>
-        <w:t>[</w:t>
-      </w:r>
-      <w:proofErr w:type="gramEnd"/>
-      <w:r>
-        <w:t>[1]]</w:t>
-      </w:r>
-    </w:p>
-    <w:p>
-      <w:r>
-        <w:t>## [1] "ZW"</w:t>
-      </w:r>
-    </w:p>
-    <w:p>
-      <w:r>
-        <w:t xml:space="preserve">## </w:t>
-      </w:r>
-    </w:p>
-    <w:p>
-      <w:r>
-        <w:t xml:space="preserve">## </w:t>
-      </w:r>
-    </w:p>
-    <w:p>
-      <w:r>
-        <w:t>## $</w:t>
-      </w:r>
-      <w:proofErr w:type="spellStart"/>
-      <w:r>
-        <w:t>clFilters$clArea</w:t>
-      </w:r>
-      <w:proofErr w:type="spellEnd"/>
-    </w:p>
-    <w:p>
-      <w:r>
-        <w:lastRenderedPageBreak/>
-        <w:t xml:space="preserve">## </w:t>
-      </w:r>
-      <w:proofErr w:type="gramStart"/>
-      <w:r>
-        <w:t>list(</w:t>
-      </w:r>
-      <w:proofErr w:type="gramEnd"/>
-      <w:r>
-        <w:t>)</w:t>
-      </w:r>
-    </w:p>
-    <w:p>
-      <w:r>
-        <w:t xml:space="preserve">## </w:t>
-      </w:r>
-    </w:p>
-    <w:p>
-      <w:r>
-        <w:t>## $</w:t>
-      </w:r>
-      <w:proofErr w:type="spellStart"/>
-      <w:r>
-        <w:t>clFilters$clSpeciesCode</w:t>
-      </w:r>
-      <w:proofErr w:type="spellEnd"/>
-    </w:p>
-    <w:p>
-      <w:r>
-        <w:t xml:space="preserve">## </w:t>
-      </w:r>
-      <w:proofErr w:type="gramStart"/>
-      <w:r>
-        <w:t>list(</w:t>
-      </w:r>
-      <w:proofErr w:type="gramEnd"/>
-      <w:r>
-        <w:t>)</w:t>
-      </w:r>
-    </w:p>
-    <w:p>
-      <w:r>
-        <w:t># 1. Initialize filter with constant parameters</w:t>
-      </w:r>
-    </w:p>
-    <w:p>
-      <w:proofErr w:type="spellStart"/>
-      <w:r>
-        <w:t>my_filter</w:t>
-      </w:r>
-      <w:proofErr w:type="spellEnd"/>
-      <w:r>
-        <w:t xml:space="preserve"> &lt;-</w:t>
-      </w:r>
-    </w:p>
-    <w:p>
-      <w:r>
-        <w:t xml:space="preserve">  </w:t>
-      </w:r>
-      <w:proofErr w:type="gramStart"/>
-      <w:r>
-        <w:t>c(</w:t>
-      </w:r>
-      <w:proofErr w:type="gramEnd"/>
-    </w:p>
-    <w:p>
-      <w:r>
-        <w:t xml:space="preserve">    </w:t>
-      </w:r>
-      <w:proofErr w:type="gramStart"/>
-      <w:r>
-        <w:t>list(</w:t>
-      </w:r>
-      <w:proofErr w:type="gramEnd"/>
-    </w:p>
-    <w:p>
-      <w:r>
-        <w:t xml:space="preserve">      </w:t>
-      </w:r>
-      <w:proofErr w:type="spellStart"/>
-      <w:r>
-        <w:t>dataType</w:t>
-      </w:r>
-      <w:proofErr w:type="spellEnd"/>
-      <w:r>
-        <w:t xml:space="preserve">          = </w:t>
-      </w:r>
-      <w:proofErr w:type="spellStart"/>
-      <w:r>
-        <w:t>selected_type</w:t>
-      </w:r>
-      <w:proofErr w:type="spellEnd"/>
-      <w:r>
-        <w:t>,</w:t>
-      </w:r>
-    </w:p>
-    <w:p>
-      <w:r>
-        <w:t xml:space="preserve">      format            = </w:t>
-      </w:r>
-      <w:proofErr w:type="spellStart"/>
-      <w:r>
-        <w:t>selected_format</w:t>
-      </w:r>
-      <w:proofErr w:type="spellEnd"/>
-    </w:p>
-    <w:p>
-      <w:r>
-        <w:t xml:space="preserve">    ),</w:t>
-      </w:r>
-    </w:p>
-    <w:p>
-      <w:r>
-        <w:t xml:space="preserve">    </w:t>
-      </w:r>
-      <w:proofErr w:type="spellStart"/>
-      <w:r>
-        <w:t>selected_filter</w:t>
-      </w:r>
-      <w:proofErr w:type="spellEnd"/>
-    </w:p>
-    <w:p>
-      <w:r>
-        <w:t xml:space="preserve">  )</w:t>
-      </w:r>
-    </w:p>
-    <w:p/>
-    <w:p>
-      <w:r>
-        <w:t># 3. Execute</w:t>
-      </w:r>
-    </w:p>
-    <w:p>
-      <w:proofErr w:type="spellStart"/>
-      <w:r>
-        <w:t>zipfile</w:t>
-      </w:r>
-      <w:proofErr w:type="spellEnd"/>
-      <w:r>
-        <w:t xml:space="preserve"> &lt;- </w:t>
-      </w:r>
-      <w:proofErr w:type="spellStart"/>
-      <w:r>
-        <w:t>rdbes_download_</w:t>
-      </w:r>
-      <w:proofErr w:type="gramStart"/>
-      <w:r>
-        <w:t>data</w:t>
-      </w:r>
-      <w:proofErr w:type="spellEnd"/>
-      <w:r>
-        <w:t>(</w:t>
-      </w:r>
-      <w:proofErr w:type="gramEnd"/>
-      <w:r>
-        <w:t xml:space="preserve">payload = </w:t>
-      </w:r>
-      <w:proofErr w:type="spellStart"/>
-      <w:r>
-        <w:t>my_filter</w:t>
-      </w:r>
-      <w:proofErr w:type="spellEnd"/>
-      <w:r>
-        <w:t xml:space="preserve">, </w:t>
-      </w:r>
-      <w:proofErr w:type="spellStart"/>
-      <w:r>
-        <w:t>dest_dir</w:t>
-      </w:r>
-      <w:proofErr w:type="spellEnd"/>
-      <w:r>
-        <w:t xml:space="preserve"> = </w:t>
-      </w:r>
-      <w:proofErr w:type="spellStart"/>
-      <w:proofErr w:type="gramStart"/>
-      <w:r>
-        <w:t>tempdir</w:t>
-      </w:r>
-      <w:proofErr w:type="spellEnd"/>
-      <w:r>
-        <w:t>(</w:t>
-      </w:r>
-      <w:proofErr w:type="gramEnd"/>
-      <w:r>
-        <w:t>))</w:t>
-      </w:r>
-    </w:p>
-    <w:p>
-      <w:r>
-        <w:t>## [201 Created] Create Export Job</w:t>
-      </w:r>
-    </w:p>
-    <w:p/>
-    <w:p>
-      <w:r>
-        <w:t>## Job ID: 54d1e521-1aa1-4fc0-83dd-6a000df1d798. Polling for completion...</w:t>
-      </w:r>
-    </w:p>
-    <w:p/>
-    <w:p>
-      <w:r>
-        <w:t>## [200 OK] Check Status</w:t>
-      </w:r>
-    </w:p>
-    <w:p/>
-    <w:p>
-      <w:r>
-        <w:t>## Job Completed!</w:t>
-      </w:r>
-    </w:p>
-    <w:p/>
-    <w:p>
-      <w:r>
-        <w:t>## [200 OK] Download File</w:t>
-      </w:r>
-    </w:p>
-    <w:p/>
-    <w:p>
-      <w:r>
-        <w:t>## Process finished. File saved: /</w:t>
-      </w:r>
-      <w:proofErr w:type="spellStart"/>
-      <w:r>
-        <w:t>tmp</w:t>
-      </w:r>
-      <w:proofErr w:type="spellEnd"/>
-      <w:r>
-        <w:t>/RtmpF47iyo/export_54d1e521-1aa1-4fc0-83dd-6a000df1d798.zip</w:t>
-      </w:r>
-    </w:p>
-    <w:p>
-      <w:r>
-        <w:lastRenderedPageBreak/>
-        <w:t xml:space="preserve"># </w:t>
-      </w:r>
-      <w:proofErr w:type="gramStart"/>
-      <w:r>
-        <w:t>list</w:t>
-      </w:r>
-      <w:proofErr w:type="gramEnd"/>
-      <w:r>
-        <w:t xml:space="preserve"> the contents of the downloaded ZIP file</w:t>
-      </w:r>
-    </w:p>
-    <w:p>
-      <w:proofErr w:type="gramStart"/>
-      <w:r>
-        <w:t>unzip(</w:t>
-      </w:r>
-      <w:proofErr w:type="spellStart"/>
-      <w:proofErr w:type="gramEnd"/>
-      <w:r>
-        <w:t>zipfile</w:t>
-      </w:r>
-      <w:proofErr w:type="spellEnd"/>
-      <w:r>
-        <w:t>, list = TRUE)</w:t>
-      </w:r>
-    </w:p>
-    <w:p>
-      <w:r>
-        <w:t>##             Name Length                Date</w:t>
-      </w:r>
-    </w:p>
-    <w:p>
-      <w:r>
-        <w:t>## 1        HCL.csv    898 2026-05-13 13:36:00</w:t>
-      </w:r>
-    </w:p>
-    <w:p>
-      <w:r>
-        <w:t>## 2 Disclaimer.txt    810 2026-05-13 13:36:00</w:t>
-      </w:r>
-    </w:p>
-    <w:p>
-      <w:r>
-        <w:t xml:space="preserve"># </w:t>
-      </w:r>
-      <w:proofErr w:type="gramStart"/>
-      <w:r>
-        <w:t>list</w:t>
-      </w:r>
-      <w:proofErr w:type="gramEnd"/>
-      <w:r>
-        <w:t xml:space="preserve"> the contents of the downloaded ZIP file to local directory</w:t>
-      </w:r>
-    </w:p>
-    <w:p>
-      <w:proofErr w:type="gramStart"/>
-      <w:r>
-        <w:t>unzip(</w:t>
-      </w:r>
-      <w:proofErr w:type="spellStart"/>
-      <w:proofErr w:type="gramEnd"/>
-      <w:r>
-        <w:t>zipfile</w:t>
-      </w:r>
-      <w:proofErr w:type="spellEnd"/>
-      <w:r>
-        <w:t xml:space="preserve">, </w:t>
-      </w:r>
-      <w:proofErr w:type="spellStart"/>
-      <w:r>
-        <w:t>exdir</w:t>
-      </w:r>
-      <w:proofErr w:type="spellEnd"/>
-      <w:r>
-        <w:t xml:space="preserve"> = "</w:t>
-      </w:r>
-      <w:proofErr w:type="spellStart"/>
-      <w:r>
-        <w:t>rdbes</w:t>
-      </w:r>
-      <w:proofErr w:type="spellEnd"/>
-      <w:r>
-        <w:t>")</w:t>
-      </w:r>
-    </w:p>
     <w:p>
       <w:proofErr w:type="spellStart"/>
       <w:r>
@@ -6238,15 +5818,7 @@
       </w:r>
       <w:proofErr w:type="spellEnd"/>
       <w:r>
-        <w:t xml:space="preserve"> &lt;- </w:t>
-      </w:r>
-      <w:proofErr w:type="gramStart"/>
-      <w:r>
-        <w:t>read.csv(</w:t>
-      </w:r>
-      <w:proofErr w:type="gramEnd"/>
-      <w:r>
-        <w:t>"</w:t>
+        <w:t xml:space="preserve"> &lt;- read.csv("</w:t>
       </w:r>
       <w:proofErr w:type="spellStart"/>
       <w:r>
@@ -6280,15 +5852,7 @@
         </w:numPr>
       </w:pPr>
       <w:r>
-        <w:t xml:space="preserve">Multiple Values: You can filter for multiple values like this: </w:t>
-      </w:r>
-      <w:proofErr w:type="gramStart"/>
-      <w:r>
-        <w:t>list(</w:t>
-      </w:r>
-      <w:proofErr w:type="gramEnd"/>
-      <w:r>
-        <w:t>“2023”, “2024”).</w:t>
+        <w:t>Multiple Values: You can filter for multiple values like this: list(“2023”, “2024”).</w:t>
       </w:r>
     </w:p>
     <w:p>
@@ -6334,11 +5898,9 @@
       </w:r>
     </w:p>
     <w:p>
-      <w:proofErr w:type="gramStart"/>
       <w:r>
         <w:t>list(</w:t>
       </w:r>
-      <w:proofErr w:type="gramEnd"/>
     </w:p>
     <w:p>
       <w:r>
@@ -6360,28 +5922,12 @@
     </w:p>
     <w:p>
       <w:r>
-        <w:t xml:space="preserve">  hierarchies       = </w:t>
-      </w:r>
-      <w:proofErr w:type="gramStart"/>
-      <w:r>
-        <w:t>list(</w:t>
-      </w:r>
-      <w:proofErr w:type="gramEnd"/>
-      <w:r>
-        <w:t>list of hierarchies),</w:t>
-      </w:r>
-    </w:p>
-    <w:p>
-      <w:r>
-        <w:t xml:space="preserve">  [datatype]Filters         = </w:t>
-      </w:r>
-      <w:proofErr w:type="gramStart"/>
-      <w:r>
-        <w:t>list(</w:t>
-      </w:r>
-      <w:proofErr w:type="gramEnd"/>
-      <w:r>
-        <w:t xml:space="preserve">[list of filters depending on the </w:t>
+        <w:t xml:space="preserve">  hierarchies       = list(list of hierarchies),</w:t>
+      </w:r>
+    </w:p>
+    <w:p>
+      <w:r>
+        <w:t xml:space="preserve">  [datatype]Filters         = list([list of filters depending on the </w:t>
       </w:r>
       <w:proofErr w:type="spellStart"/>
       <w:r>
@@ -6641,15 +6187,7 @@
     </w:p>
     <w:p>
       <w:r>
-        <w:t xml:space="preserve">For data submitters and national </w:t>
-      </w:r>
-      <w:proofErr w:type="gramStart"/>
-      <w:r>
-        <w:t>estimators</w:t>
-      </w:r>
-      <w:proofErr w:type="gramEnd"/>
-      <w:r>
-        <w:t xml:space="preserve"> a specific county filter must be provided e.g., “ES” or “FR” (for test data “ZW”)</w:t>
+        <w:t>For data submitters and national estimators a specific county filter must be provided e.g., “ES” or “FR” (for test data “ZW”)</w:t>
       </w:r>
     </w:p>
     <w:p>
@@ -6806,13 +6344,8 @@
       </w:r>
       <w:proofErr w:type="spellEnd"/>
       <w:r>
-        <w:t xml:space="preserve"> &lt;- </w:t>
-      </w:r>
-      <w:proofErr w:type="gramStart"/>
-      <w:r>
-        <w:t>list(</w:t>
-      </w:r>
-      <w:proofErr w:type="gramEnd"/>
+        <w:t xml:space="preserve"> &lt;- list(</w:t>
+      </w:r>
     </w:p>
     <w:p>
       <w:r>
@@ -6843,15 +6376,7 @@
     <w:p>
       <w:r>
         <w:lastRenderedPageBreak/>
-        <w:t xml:space="preserve">  hierarchies       = </w:t>
-      </w:r>
-      <w:proofErr w:type="gramStart"/>
-      <w:r>
-        <w:t>list(</w:t>
-      </w:r>
-      <w:proofErr w:type="gramEnd"/>
-      <w:r>
-        <w:t>"H1", "H5", "H6", "H13"),</w:t>
+        <w:t xml:space="preserve">  hierarchies       = list("H1", "H5", "H6", "H13"),</w:t>
       </w:r>
     </w:p>
     <w:p>
@@ -6864,13 +6389,8 @@
       </w:r>
       <w:proofErr w:type="spellEnd"/>
       <w:r>
-        <w:t xml:space="preserve">         = </w:t>
-      </w:r>
-      <w:proofErr w:type="gramStart"/>
-      <w:r>
-        <w:t>list(</w:t>
-      </w:r>
-      <w:proofErr w:type="gramEnd"/>
+        <w:t xml:space="preserve">         = list(</w:t>
+      </w:r>
     </w:p>
     <w:p>
       <w:r>
@@ -6882,15 +6402,7 @@
       </w:r>
       <w:proofErr w:type="spellEnd"/>
       <w:r>
-        <w:t xml:space="preserve">         = list("All"</w:t>
-      </w:r>
-      <w:proofErr w:type="gramStart"/>
-      <w:r>
-        <w:t>),  #</w:t>
-      </w:r>
-      <w:proofErr w:type="gramEnd"/>
-      <w:r>
-        <w:t xml:space="preserve"> Mandatory for Permissions</w:t>
+        <w:t xml:space="preserve">         = list("All"),  # Mandatory for Permissions</w:t>
       </w:r>
     </w:p>
     <w:p>
@@ -6903,15 +6415,7 @@
       </w:r>
       <w:proofErr w:type="spellEnd"/>
       <w:r>
-        <w:t xml:space="preserve">            = </w:t>
-      </w:r>
-      <w:proofErr w:type="gramStart"/>
-      <w:r>
-        <w:t>list(</w:t>
-      </w:r>
-      <w:proofErr w:type="gramEnd"/>
-      <w:r>
-        <w:t>"2024") # Available Optional Filter</w:t>
+        <w:t xml:space="preserve">            = list("2024") # Available Optional Filter</w:t>
       </w:r>
     </w:p>
     <w:p>
@@ -6919,25 +6423,12 @@
         <w:t xml:space="preserve">    # </w:t>
       </w:r>
       <w:proofErr w:type="spellStart"/>
-      <w:proofErr w:type="gramStart"/>
       <w:r>
         <w:t>deSamplingScheme</w:t>
       </w:r>
       <w:proofErr w:type="spellEnd"/>
       <w:r>
-        <w:t xml:space="preserve">  =</w:t>
-      </w:r>
-      <w:proofErr w:type="gramEnd"/>
-      <w:r>
-        <w:t xml:space="preserve"> </w:t>
-      </w:r>
-      <w:proofErr w:type="gramStart"/>
-      <w:r>
-        <w:t xml:space="preserve">list(),   </w:t>
-      </w:r>
-      <w:proofErr w:type="gramEnd"/>
-      <w:r>
-        <w:t xml:space="preserve">    # Available Optional Filter</w:t>
+        <w:t xml:space="preserve">  = list(),       # Available Optional Filter</w:t>
       </w:r>
     </w:p>
     <w:p>
@@ -6950,15 +6441,7 @@
       </w:r>
       <w:proofErr w:type="spellEnd"/>
       <w:r>
-        <w:t xml:space="preserve">     = </w:t>
-      </w:r>
-      <w:proofErr w:type="gramStart"/>
-      <w:r>
-        <w:t xml:space="preserve">list(),   </w:t>
-      </w:r>
-      <w:proofErr w:type="gramEnd"/>
-      <w:r>
-        <w:t xml:space="preserve">  # Available Optional Filter</w:t>
+        <w:t xml:space="preserve">     = list(),     # Available Optional Filter</w:t>
       </w:r>
     </w:p>
     <w:p>
@@ -6971,15 +6454,7 @@
       </w:r>
       <w:proofErr w:type="spellEnd"/>
       <w:r>
-        <w:t xml:space="preserve">     = </w:t>
-      </w:r>
-      <w:proofErr w:type="gramStart"/>
-      <w:r>
-        <w:t xml:space="preserve">list(),   </w:t>
-      </w:r>
-      <w:proofErr w:type="gramEnd"/>
-      <w:r>
-        <w:t xml:space="preserve">    # Available Optional Filter</w:t>
+        <w:t xml:space="preserve">     = list(),       # Available Optional Filter</w:t>
       </w:r>
     </w:p>
     <w:p>
@@ -6992,39 +6467,7 @@
       </w:r>
       <w:proofErr w:type="spellEnd"/>
       <w:r>
-        <w:t xml:space="preserve">            = </w:t>
-      </w:r>
-      <w:proofErr w:type="gramStart"/>
-      <w:r>
-        <w:t>list(</w:t>
-      </w:r>
-      <w:proofErr w:type="gramEnd"/>
-      <w:r>
-        <w:t>"27.</w:t>
-      </w:r>
-      <w:proofErr w:type="gramStart"/>
-      <w:r>
-        <w:t>2.a</w:t>
-      </w:r>
-      <w:proofErr w:type="gramEnd"/>
-      <w:r>
-        <w:t>", "27.</w:t>
-      </w:r>
-      <w:proofErr w:type="gramStart"/>
-      <w:r>
-        <w:t>8.a</w:t>
-      </w:r>
-      <w:proofErr w:type="gramEnd"/>
-      <w:r>
-        <w:t>"</w:t>
-      </w:r>
-      <w:proofErr w:type="gramStart"/>
-      <w:r>
-        <w:t xml:space="preserve">),   </w:t>
-      </w:r>
-      <w:proofErr w:type="gramEnd"/>
-      <w:r>
-        <w:t xml:space="preserve">    # Available Optional Filter</w:t>
+        <w:t xml:space="preserve">            = list("27.2.a", "27.8.a"),       # Available Optional Filter</w:t>
       </w:r>
     </w:p>
     <w:p>
@@ -7037,31 +6480,7 @@
       </w:r>
       <w:proofErr w:type="spellEnd"/>
       <w:r>
-        <w:t xml:space="preserve">            = </w:t>
-      </w:r>
-      <w:proofErr w:type="gramStart"/>
-      <w:r>
-        <w:t>list(</w:t>
-      </w:r>
-      <w:proofErr w:type="gramEnd"/>
-      <w:r>
-        <w:t>"27.</w:t>
-      </w:r>
-      <w:proofErr w:type="gramStart"/>
-      <w:r>
-        <w:t>2.a</w:t>
-      </w:r>
-      <w:proofErr w:type="gramEnd"/>
-      <w:r>
-        <w:t>", "27.</w:t>
-      </w:r>
-      <w:proofErr w:type="gramStart"/>
-      <w:r>
-        <w:t xml:space="preserve">8.a")   </w:t>
-      </w:r>
-      <w:proofErr w:type="gramEnd"/>
-      <w:r>
-        <w:t xml:space="preserve">     # Available Optional Filter</w:t>
+        <w:t xml:space="preserve">            = list("27.2.a", "27.8.a")        # Available Optional Filter</w:t>
       </w:r>
     </w:p>
     <w:p>
@@ -7078,19 +6497,11 @@
     <w:p>
       <w:proofErr w:type="spellStart"/>
       <w:r>
-        <w:t>rdbes_download_</w:t>
-      </w:r>
-      <w:proofErr w:type="gramStart"/>
-      <w:r>
-        <w:t>data</w:t>
-      </w:r>
-      <w:proofErr w:type="spellEnd"/>
-      <w:r>
-        <w:t>(</w:t>
-      </w:r>
-      <w:proofErr w:type="gramEnd"/>
-      <w:r>
-        <w:t xml:space="preserve">payload = </w:t>
+        <w:t>rdbes_download_data</w:t>
+      </w:r>
+      <w:proofErr w:type="spellEnd"/>
+      <w:r>
+        <w:t xml:space="preserve">(payload = </w:t>
       </w:r>
       <w:proofErr w:type="spellStart"/>
       <w:r>
@@ -7131,13 +6542,8 @@
       </w:r>
       <w:proofErr w:type="spellEnd"/>
       <w:r>
-        <w:t xml:space="preserve"> &lt;- </w:t>
-      </w:r>
-      <w:proofErr w:type="gramStart"/>
-      <w:r>
-        <w:t>list(</w:t>
-      </w:r>
-      <w:proofErr w:type="gramEnd"/>
+        <w:t xml:space="preserve"> &lt;- list(</w:t>
+      </w:r>
     </w:p>
     <w:p>
       <w:r>
@@ -7180,13 +6586,8 @@
       </w:r>
       <w:proofErr w:type="spellEnd"/>
       <w:r>
-        <w:t xml:space="preserve">         = </w:t>
-      </w:r>
-      <w:proofErr w:type="gramStart"/>
-      <w:r>
-        <w:t>list(</w:t>
-      </w:r>
-      <w:proofErr w:type="gramEnd"/>
+        <w:t xml:space="preserve">         = list(</w:t>
+      </w:r>
     </w:p>
     <w:p>
       <w:r>
@@ -7211,23 +6612,7 @@
       </w:r>
       <w:proofErr w:type="spellEnd"/>
       <w:r>
-        <w:t xml:space="preserve">              = </w:t>
-      </w:r>
-      <w:proofErr w:type="gramStart"/>
-      <w:r>
-        <w:t>list(</w:t>
-      </w:r>
-      <w:proofErr w:type="gramEnd"/>
-      <w:r>
-        <w:t>"2024</w:t>
-      </w:r>
-      <w:proofErr w:type="gramStart"/>
-      <w:r>
-        <w:t>")  #</w:t>
-      </w:r>
-      <w:proofErr w:type="gramEnd"/>
-      <w:r>
-        <w:t xml:space="preserve"> Available Optional Filter</w:t>
+        <w:t xml:space="preserve">              = list("2024")  # Available Optional Filter</w:t>
       </w:r>
     </w:p>
     <w:p>
@@ -7240,15 +6625,7 @@
       </w:r>
       <w:proofErr w:type="spellEnd"/>
       <w:r>
-        <w:t xml:space="preserve">              = </w:t>
-      </w:r>
-      <w:proofErr w:type="gramStart"/>
-      <w:r>
-        <w:t xml:space="preserve">list(),   </w:t>
-      </w:r>
-      <w:proofErr w:type="gramEnd"/>
-      <w:r>
-        <w:t xml:space="preserve">   # Available Optional Filter</w:t>
+        <w:t xml:space="preserve">              = list(),      # Available Optional Filter</w:t>
       </w:r>
     </w:p>
     <w:p>
@@ -7261,15 +6638,7 @@
       </w:r>
       <w:proofErr w:type="spellEnd"/>
       <w:r>
-        <w:t xml:space="preserve">       = </w:t>
-      </w:r>
-      <w:proofErr w:type="gramStart"/>
-      <w:r>
-        <w:t>list(</w:t>
-      </w:r>
-      <w:proofErr w:type="gramEnd"/>
-      <w:r>
-        <w:t>)       # Available Optional Filter</w:t>
+        <w:t xml:space="preserve">       = list()       # Available Optional Filter</w:t>
       </w:r>
     </w:p>
     <w:p>
@@ -7287,19 +6656,11 @@
       <w:proofErr w:type="spellStart"/>
       <w:r>
         <w:lastRenderedPageBreak/>
-        <w:t>rdbes_download_</w:t>
-      </w:r>
-      <w:proofErr w:type="gramStart"/>
-      <w:r>
-        <w:t>data</w:t>
-      </w:r>
-      <w:proofErr w:type="spellEnd"/>
-      <w:r>
-        <w:t>(</w:t>
-      </w:r>
-      <w:proofErr w:type="gramEnd"/>
-      <w:r>
-        <w:t xml:space="preserve">payload = </w:t>
+        <w:t>rdbes_download_data</w:t>
+      </w:r>
+      <w:proofErr w:type="spellEnd"/>
+      <w:r>
+        <w:t xml:space="preserve">(payload = </w:t>
       </w:r>
       <w:proofErr w:type="spellStart"/>
       <w:r>
@@ -7340,13 +6701,8 @@
       </w:r>
       <w:proofErr w:type="spellEnd"/>
       <w:r>
-        <w:t xml:space="preserve"> &lt;- </w:t>
-      </w:r>
-      <w:proofErr w:type="gramStart"/>
-      <w:r>
-        <w:t>list(</w:t>
-      </w:r>
-      <w:proofErr w:type="gramEnd"/>
+        <w:t xml:space="preserve"> &lt;- list(</w:t>
+      </w:r>
     </w:p>
     <w:p>
       <w:r>
@@ -7389,13 +6745,8 @@
       </w:r>
       <w:proofErr w:type="spellEnd"/>
       <w:r>
-        <w:t xml:space="preserve">         = </w:t>
-      </w:r>
-      <w:proofErr w:type="gramStart"/>
-      <w:r>
-        <w:t>list(</w:t>
-      </w:r>
-      <w:proofErr w:type="gramEnd"/>
+        <w:t xml:space="preserve">         = list(</w:t>
+      </w:r>
     </w:p>
     <w:p>
       <w:r>
@@ -7420,23 +6771,7 @@
       </w:r>
       <w:proofErr w:type="spellEnd"/>
       <w:r>
-        <w:t xml:space="preserve">              = </w:t>
-      </w:r>
-      <w:proofErr w:type="gramStart"/>
-      <w:r>
-        <w:t>list(</w:t>
-      </w:r>
-      <w:proofErr w:type="gramEnd"/>
-      <w:r>
-        <w:t>"2024</w:t>
-      </w:r>
-      <w:proofErr w:type="gramStart"/>
-      <w:r>
-        <w:t>")  #</w:t>
-      </w:r>
-      <w:proofErr w:type="gramEnd"/>
-      <w:r>
-        <w:t xml:space="preserve"> Available Optional Filter</w:t>
+        <w:t xml:space="preserve">              = list("2024")  # Available Optional Filter</w:t>
       </w:r>
     </w:p>
     <w:p>
@@ -7449,15 +6784,7 @@
       </w:r>
       <w:proofErr w:type="spellEnd"/>
       <w:r>
-        <w:t xml:space="preserve">              = </w:t>
-      </w:r>
-      <w:proofErr w:type="gramStart"/>
-      <w:r>
-        <w:t>list(</w:t>
-      </w:r>
-      <w:proofErr w:type="gramEnd"/>
-      <w:r>
-        <w:t>)       # Available Optional Filter</w:t>
+        <w:t xml:space="preserve">              = list()       # Available Optional Filter</w:t>
       </w:r>
     </w:p>
     <w:p>
@@ -7474,19 +6801,11 @@
     <w:p>
       <w:proofErr w:type="spellStart"/>
       <w:r>
-        <w:t>rdbes_download_</w:t>
-      </w:r>
-      <w:proofErr w:type="gramStart"/>
-      <w:r>
-        <w:t>data</w:t>
-      </w:r>
-      <w:proofErr w:type="spellEnd"/>
-      <w:r>
-        <w:t>(</w:t>
-      </w:r>
-      <w:proofErr w:type="gramEnd"/>
-      <w:r>
-        <w:t xml:space="preserve">payload = </w:t>
+        <w:t>rdbes_download_data</w:t>
+      </w:r>
+      <w:proofErr w:type="spellEnd"/>
+      <w:r>
+        <w:t xml:space="preserve">(payload = </w:t>
       </w:r>
       <w:proofErr w:type="spellStart"/>
       <w:r>
@@ -7527,13 +6846,8 @@
       </w:r>
       <w:proofErr w:type="spellEnd"/>
       <w:r>
-        <w:t xml:space="preserve"> &lt;- </w:t>
-      </w:r>
-      <w:proofErr w:type="gramStart"/>
-      <w:r>
-        <w:t>list(</w:t>
-      </w:r>
-      <w:proofErr w:type="gramEnd"/>
+        <w:t xml:space="preserve"> &lt;- list(</w:t>
+      </w:r>
     </w:p>
     <w:p>
       <w:r>
@@ -7576,13 +6890,8 @@
       </w:r>
       <w:proofErr w:type="spellEnd"/>
       <w:r>
-        <w:t xml:space="preserve">         = </w:t>
-      </w:r>
-      <w:proofErr w:type="gramStart"/>
-      <w:r>
-        <w:t>list(</w:t>
-      </w:r>
-      <w:proofErr w:type="gramEnd"/>
+        <w:t xml:space="preserve">         = list(</w:t>
+      </w:r>
     </w:p>
     <w:p>
       <w:r>
@@ -7594,15 +6903,7 @@
       </w:r>
       <w:proofErr w:type="spellEnd"/>
       <w:r>
-        <w:t xml:space="preserve">         = list("All"</w:t>
-      </w:r>
-      <w:proofErr w:type="gramStart"/>
-      <w:r>
-        <w:t>),  #</w:t>
-      </w:r>
-      <w:proofErr w:type="gramEnd"/>
-      <w:r>
-        <w:t xml:space="preserve"> Mandatory for Permissions</w:t>
+        <w:t xml:space="preserve">         = list("All"),  # Mandatory for Permissions</w:t>
       </w:r>
     </w:p>
     <w:p>
@@ -7615,23 +6916,7 @@
       </w:r>
       <w:proofErr w:type="spellEnd"/>
       <w:r>
-        <w:t xml:space="preserve">            = </w:t>
-      </w:r>
-      <w:proofErr w:type="gramStart"/>
-      <w:r>
-        <w:t>list(</w:t>
-      </w:r>
-      <w:proofErr w:type="gramEnd"/>
-      <w:r>
-        <w:t>"2024</w:t>
-      </w:r>
-      <w:proofErr w:type="gramStart"/>
-      <w:r>
-        <w:t>")  #</w:t>
-      </w:r>
-      <w:proofErr w:type="gramEnd"/>
-      <w:r>
-        <w:t xml:space="preserve"> Available Optional Filter</w:t>
+        <w:t xml:space="preserve">            = list("2024")  # Available Optional Filter</w:t>
       </w:r>
     </w:p>
     <w:p>
@@ -7644,23 +6929,7 @@
       </w:r>
       <w:proofErr w:type="spellEnd"/>
       <w:r>
-        <w:t xml:space="preserve"> = </w:t>
-      </w:r>
-      <w:proofErr w:type="gramStart"/>
-      <w:r>
-        <w:t>list(</w:t>
-      </w:r>
-      <w:proofErr w:type="gramEnd"/>
-      <w:r>
-        <w:t>""</w:t>
-      </w:r>
-      <w:proofErr w:type="gramStart"/>
-      <w:r>
-        <w:t xml:space="preserve">),   </w:t>
-      </w:r>
-      <w:proofErr w:type="gramEnd"/>
-      <w:r>
-        <w:t xml:space="preserve">  # Available Optional Filter</w:t>
+        <w:t xml:space="preserve"> = list(""),     # Available Optional Filter</w:t>
       </w:r>
     </w:p>
     <w:p>
@@ -7673,15 +6942,7 @@
       </w:r>
       <w:proofErr w:type="spellEnd"/>
       <w:r>
-        <w:t xml:space="preserve">   = </w:t>
-      </w:r>
-      <w:proofErr w:type="gramStart"/>
-      <w:r>
-        <w:t>list(</w:t>
-      </w:r>
-      <w:proofErr w:type="gramEnd"/>
-      <w:r>
-        <w:t>)        # Available Optional Filter</w:t>
+        <w:t xml:space="preserve">   = list()        # Available Optional Filter</w:t>
       </w:r>
     </w:p>
     <w:p>
@@ -7699,19 +6960,11 @@
     <w:p>
       <w:proofErr w:type="spellStart"/>
       <w:r>
-        <w:t>rdbes_download_</w:t>
-      </w:r>
-      <w:proofErr w:type="gramStart"/>
-      <w:r>
-        <w:t>data</w:t>
-      </w:r>
-      <w:proofErr w:type="spellEnd"/>
-      <w:r>
-        <w:t>(</w:t>
-      </w:r>
-      <w:proofErr w:type="gramEnd"/>
-      <w:r>
-        <w:t xml:space="preserve">payload = </w:t>
+        <w:t>rdbes_download_data</w:t>
+      </w:r>
+      <w:proofErr w:type="spellEnd"/>
+      <w:r>
+        <w:t xml:space="preserve">(payload = </w:t>
       </w:r>
       <w:proofErr w:type="spellStart"/>
       <w:r>
@@ -7752,13 +7005,8 @@
       </w:r>
       <w:proofErr w:type="spellEnd"/>
       <w:r>
-        <w:t xml:space="preserve"> &lt;- </w:t>
-      </w:r>
-      <w:proofErr w:type="gramStart"/>
-      <w:r>
-        <w:t>list(</w:t>
-      </w:r>
-      <w:proofErr w:type="gramEnd"/>
+        <w:t xml:space="preserve"> &lt;- list(</w:t>
+      </w:r>
     </w:p>
     <w:p>
       <w:r>
@@ -7801,13 +7049,8 @@
       </w:r>
       <w:proofErr w:type="spellEnd"/>
       <w:r>
-        <w:t xml:space="preserve">         = </w:t>
-      </w:r>
-      <w:proofErr w:type="gramStart"/>
-      <w:r>
-        <w:t>list(</w:t>
-      </w:r>
-      <w:proofErr w:type="gramEnd"/>
+        <w:t xml:space="preserve">         = list(</w:t>
+      </w:r>
     </w:p>
     <w:p>
       <w:r>
@@ -7819,15 +7062,7 @@
       </w:r>
       <w:proofErr w:type="spellEnd"/>
       <w:r>
-        <w:t xml:space="preserve"> = list("All"</w:t>
-      </w:r>
-      <w:proofErr w:type="gramStart"/>
-      <w:r>
-        <w:t xml:space="preserve">),   </w:t>
-      </w:r>
-      <w:proofErr w:type="gramEnd"/>
-      <w:r>
-        <w:t xml:space="preserve">        # Mandatory for Permissions</w:t>
+        <w:t xml:space="preserve"> = list("All"),           # Mandatory for Permissions</w:t>
       </w:r>
     </w:p>
     <w:p>
@@ -7840,23 +7075,7 @@
       </w:r>
       <w:proofErr w:type="spellEnd"/>
       <w:r>
-        <w:t xml:space="preserve">    = </w:t>
-      </w:r>
-      <w:proofErr w:type="gramStart"/>
-      <w:r>
-        <w:t>list(</w:t>
-      </w:r>
-      <w:proofErr w:type="gramEnd"/>
-      <w:r>
-        <w:t>"2024</w:t>
-      </w:r>
-      <w:proofErr w:type="gramStart"/>
-      <w:r>
-        <w:t xml:space="preserve">")   </w:t>
-      </w:r>
-      <w:proofErr w:type="gramEnd"/>
-      <w:r>
-        <w:t xml:space="preserve">        # Available Optional Filter</w:t>
+        <w:t xml:space="preserve">    = list("2024")           # Available Optional Filter</w:t>
       </w:r>
     </w:p>
     <w:p>
@@ -7873,19 +7092,11 @@
     <w:p>
       <w:proofErr w:type="spellStart"/>
       <w:r>
-        <w:t>rdbes_download_</w:t>
-      </w:r>
-      <w:proofErr w:type="gramStart"/>
-      <w:r>
-        <w:t>data</w:t>
-      </w:r>
-      <w:proofErr w:type="spellEnd"/>
-      <w:r>
-        <w:t>(</w:t>
-      </w:r>
-      <w:proofErr w:type="gramEnd"/>
-      <w:r>
-        <w:t xml:space="preserve">payload = </w:t>
+        <w:t>rdbes_download_data</w:t>
+      </w:r>
+      <w:proofErr w:type="spellEnd"/>
+      <w:r>
+        <w:t xml:space="preserve">(payload = </w:t>
       </w:r>
       <w:proofErr w:type="spellStart"/>
       <w:r>
@@ -7913,33 +7124,17 @@
     </w:p>
     <w:p>
       <w:r>
-        <w:t xml:space="preserve">To use the development </w:t>
-      </w:r>
-      <w:proofErr w:type="gramStart"/>
-      <w:r>
-        <w:t>database</w:t>
-      </w:r>
-      <w:proofErr w:type="gramEnd"/>
-      <w:r>
-        <w:t xml:space="preserve"> you need to run the following code before you download data:</w:t>
-      </w:r>
-    </w:p>
-    <w:p>
-      <w:proofErr w:type="spellStart"/>
-      <w:r>
-        <w:t>use_</w:t>
-      </w:r>
-      <w:proofErr w:type="gramStart"/>
-      <w:r>
-        <w:t>sboxrdbes</w:t>
-      </w:r>
-      <w:proofErr w:type="spellEnd"/>
-      <w:r>
-        <w:t>(</w:t>
-      </w:r>
-      <w:proofErr w:type="gramEnd"/>
-      <w:r>
-        <w:t>TRUE)</w:t>
+        <w:t>To use the development database you need to run the following code before you download data:</w:t>
+      </w:r>
+    </w:p>
+    <w:p>
+      <w:proofErr w:type="spellStart"/>
+      <w:r>
+        <w:t>use_sboxrdbes</w:t>
+      </w:r>
+      <w:proofErr w:type="spellEnd"/>
+      <w:r>
+        <w:t>(TRUE)</w:t>
       </w:r>
     </w:p>
     <w:p>
@@ -7963,19 +7158,11 @@
     <w:p>
       <w:proofErr w:type="spellStart"/>
       <w:r>
-        <w:t>use_</w:t>
-      </w:r>
-      <w:proofErr w:type="gramStart"/>
-      <w:r>
-        <w:t>sboxrdbes</w:t>
-      </w:r>
-      <w:proofErr w:type="spellEnd"/>
-      <w:r>
-        <w:t>(</w:t>
-      </w:r>
-      <w:proofErr w:type="gramEnd"/>
-      <w:r>
-        <w:t>FALSE)</w:t>
+        <w:t>use_sboxrdbes</w:t>
+      </w:r>
+      <w:proofErr w:type="spellEnd"/>
+      <w:r>
+        <w:t>(FALSE)</w:t>
       </w:r>
     </w:p>
     <w:p>
@@ -8878,6 +8065,7 @@
   <w:style w:type="character" w:default="1" w:styleId="DefaultParagraphFont">
     <w:name w:val="Default Paragraph Font"/>
     <w:uiPriority w:val="1"/>
+    <w:semiHidden/>
     <w:unhideWhenUsed/>
   </w:style>
   <w:style w:type="table" w:default="1" w:styleId="TableNormal">

</xml_diff>